<commit_message>
Remove old file types of 'Project standards'; Update project standards; add new Task info 03
</commit_message>
<xml_diff>
--- a/Documentation/Analysis/Project Standards/Project standards - W.docx
+++ b/Documentation/Analysis/Project Standards/Project standards - W.docx
@@ -1,40 +1,27 @@
 
 <file path=word/document.xml><?xml version="1.0" encoding="utf-8"?>
-<w:document xmlns:r="http://schemas.openxmlformats.org/officeDocument/2006/relationships" xmlns:wp="http://schemas.openxmlformats.org/drawingml/2006/wordprocessingDrawing" xmlns:w="http://schemas.openxmlformats.org/wordprocessingml/2006/main" xmlns:w10="urn:schemas-microsoft-com:office:word" xmlns:w14="http://schemas.microsoft.com/office/word/2010/wordml" xmlns:wps="http://schemas.microsoft.com/office/word/2010/wordprocessingShape" xmlns:wpg="http://schemas.microsoft.com/office/word/2010/wordprocessingGroup" xmlns:mc="http://schemas.openxmlformats.org/markup-compatibility/2006" xmlns:v="urn:schemas-microsoft-com:vml" xmlns:o="urn:schemas-microsoft-com:office:office" xmlns:m="http://schemas.openxmlformats.org/officeDocument/2006/math" mc:Ignorable="w14">
+<w:document xmlns:wpc="http://schemas.microsoft.com/office/word/2010/wordprocessingCanvas" xmlns:cx="http://schemas.microsoft.com/office/drawing/2014/chartex" xmlns:cx1="http://schemas.microsoft.com/office/drawing/2015/9/8/chartex" xmlns:cx2="http://schemas.microsoft.com/office/drawing/2015/10/21/chartex" xmlns:cx3="http://schemas.microsoft.com/office/drawing/2016/5/9/chartex" xmlns:cx4="http://schemas.microsoft.com/office/drawing/2016/5/10/chartex" xmlns:cx5="http://schemas.microsoft.com/office/drawing/2016/5/11/chartex" xmlns:cx6="http://schemas.microsoft.com/office/drawing/2016/5/12/chartex" xmlns:cx7="http://schemas.microsoft.com/office/drawing/2016/5/13/chartex" xmlns:cx8="http://schemas.microsoft.com/office/drawing/2016/5/14/chartex" xmlns:mc="http://schemas.openxmlformats.org/markup-compatibility/2006" xmlns:aink="http://schemas.microsoft.com/office/drawing/2016/ink" xmlns:am3d="http://schemas.microsoft.com/office/drawing/2017/model3d" xmlns:o="urn:schemas-microsoft-com:office:office" xmlns:oel="http://schemas.microsoft.com/office/2019/extlst" xmlns:r="http://schemas.openxmlformats.org/officeDocument/2006/relationships" xmlns:m="http://schemas.openxmlformats.org/officeDocument/2006/math" xmlns:v="urn:schemas-microsoft-com:vml" xmlns:wp14="http://schemas.microsoft.com/office/word/2010/wordprocessingDrawing" xmlns:wp="http://schemas.openxmlformats.org/drawingml/2006/wordprocessingDrawing" xmlns:w10="urn:schemas-microsoft-com:office:word" xmlns:w="http://schemas.openxmlformats.org/wordprocessingml/2006/main" xmlns:w14="http://schemas.microsoft.com/office/word/2010/wordml" xmlns:w15="http://schemas.microsoft.com/office/word/2012/wordml" xmlns:w16cex="http://schemas.microsoft.com/office/word/2018/wordml/cex" xmlns:w16cid="http://schemas.microsoft.com/office/word/2016/wordml/cid" xmlns:w16="http://schemas.microsoft.com/office/word/2018/wordml" xmlns:w16du="http://schemas.microsoft.com/office/word/2023/wordml/word16du" xmlns:w16sdtdh="http://schemas.microsoft.com/office/word/2020/wordml/sdtdatahash" xmlns:w16sdtfl="http://schemas.microsoft.com/office/word/2024/wordml/sdtformatlock" xmlns:w16se="http://schemas.microsoft.com/office/word/2015/wordml/symex" xmlns:wpg="http://schemas.microsoft.com/office/word/2010/wordprocessingGroup" xmlns:wpi="http://schemas.microsoft.com/office/word/2010/wordprocessingInk" xmlns:wne="http://schemas.microsoft.com/office/word/2006/wordml" xmlns:wps="http://schemas.microsoft.com/office/word/2010/wordprocessingShape" mc:Ignorable="w14 w15 w16se w16cid w16 w16cex w16sdtdh w16sdtfl w16du wp14">
   <w:body>
     <w:p>
       <w:pPr>
         <w:pStyle w:val="Title"/>
-        <w:bidi w:val="1"/>
-        <w:ind w:left="0" w:right="0" w:firstLine="0"/>
+        <w:bidi/>
         <w:jc w:val="center"/>
         <w:rPr>
-          <w:rFonts w:ascii="Mj_Casablanca Light" w:cs="Mj_Casablanca Light" w:hAnsi="Mj_Casablanca Light" w:eastAsia="Mj_Casablanca Light"/>
+          <w:rFonts w:ascii="Mj_Casablanca Light" w:eastAsia="Mj_Casablanca Light" w:hAnsi="Mj_Casablanca Light" w:cs="Mj_Casablanca Light" w:hint="default"/>
           <w:b w:val="0"/>
           <w:bCs w:val="0"/>
-          <w:outline w:val="0"/>
-          <w:color w:val="00a1fe"/>
-          <w:rtl w:val="1"/>
-          <w14:textFill>
-            <w14:solidFill>
-              <w14:srgbClr w14:val="00A2FF"/>
-            </w14:solidFill>
-          </w14:textFill>
+          <w:color w:val="00A2FF"/>
+          <w:rtl/>
         </w:rPr>
       </w:pPr>
       <w:r>
         <w:rPr>
-          <w:rFonts w:ascii="Arial Unicode MS" w:cs="Mj_Casablanca Light" w:hAnsi="Arial Unicode MS" w:eastAsia="Arial Unicode MS" w:hint="cs"/>
+          <w:rFonts w:cs="Mj_Casablanca Light"/>
           <w:b w:val="0"/>
           <w:bCs w:val="0"/>
-          <w:outline w:val="0"/>
-          <w:color w:val="00a1fe"/>
-          <w:rtl w:val="1"/>
-          <w14:textFill>
-            <w14:solidFill>
-              <w14:srgbClr w14:val="00A2FF"/>
-            </w14:solidFill>
-          </w14:textFill>
+          <w:color w:val="00A2FF"/>
+          <w:rtl/>
         </w:rPr>
         <w:t>به نام خدا</w:t>
       </w:r>
@@ -44,70 +31,38 @@
         <w:pStyle w:val="Title"/>
         <w:jc w:val="center"/>
         <w:rPr>
-          <w:rFonts w:ascii="Mj_Casablanca Light" w:cs="Mj_Casablanca Light" w:hAnsi="Mj_Casablanca Light" w:eastAsia="Mj_Casablanca Light"/>
+          <w:rFonts w:ascii="Mj_Casablanca Light" w:eastAsia="Mj_Casablanca Light" w:hAnsi="Mj_Casablanca Light" w:cs="Mj_Casablanca Light" w:hint="default"/>
           <w:b w:val="0"/>
           <w:bCs w:val="0"/>
-          <w:outline w:val="0"/>
-          <w:color w:val="00a1fe"/>
-          <w14:textFill>
-            <w14:solidFill>
-              <w14:srgbClr w14:val="00A2FF"/>
-            </w14:solidFill>
-          </w14:textFill>
+          <w:color w:val="00A2FF"/>
         </w:rPr>
       </w:pPr>
+      <w:proofErr w:type="spellStart"/>
       <w:r>
         <w:rPr>
-          <w:rFonts w:ascii="Arial Unicode MS" w:cs="Arial Unicode MS" w:hAnsi="Arial Unicode MS" w:eastAsia="Arial Unicode MS"/>
+          <w:rFonts w:cs="Arial Unicode MS"/>
           <w:b w:val="0"/>
           <w:bCs w:val="0"/>
-          <w:i w:val="0"/>
-          <w:iCs w:val="0"/>
-          <w:outline w:val="0"/>
-          <w:color w:val="00a1fe"/>
-          <w:rtl w:val="0"/>
-          <w:lang w:val="en-US"/>
-          <w14:textFill>
-            <w14:solidFill>
-              <w14:srgbClr w14:val="00A2FF"/>
-            </w14:solidFill>
-          </w14:textFill>
+          <w:color w:val="00A2FF"/>
         </w:rPr>
         <w:t>Csharpers</w:t>
       </w:r>
+      <w:proofErr w:type="spellEnd"/>
       <w:r>
         <w:rPr>
           <w:rFonts w:ascii="Mj_Casablanca Light" w:hAnsi="Mj_Casablanca Light"/>
           <w:b w:val="0"/>
           <w:bCs w:val="0"/>
-          <w:outline w:val="0"/>
-          <w:color w:val="00a1fe"/>
-          <w:rtl w:val="0"/>
-          <w:lang w:val="en-US"/>
-          <w14:textFill>
-            <w14:solidFill>
-              <w14:srgbClr w14:val="00A2FF"/>
-            </w14:solidFill>
-          </w14:textFill>
+          <w:color w:val="00A2FF"/>
         </w:rPr>
         <w:t xml:space="preserve"> </w:t>
       </w:r>
       <w:r>
         <w:rPr>
-          <w:rFonts w:ascii="Arial Unicode MS" w:cs="Arial Unicode MS" w:hAnsi="Arial Unicode MS" w:eastAsia="Arial Unicode MS"/>
+          <w:rFonts w:cs="Arial Unicode MS"/>
           <w:b w:val="0"/>
           <w:bCs w:val="0"/>
-          <w:i w:val="0"/>
-          <w:iCs w:val="0"/>
-          <w:outline w:val="0"/>
-          <w:color w:val="00a1fe"/>
-          <w:rtl w:val="0"/>
-          <w:lang w:val="en-US"/>
-          <w14:textFill>
-            <w14:solidFill>
-              <w14:srgbClr w14:val="00A2FF"/>
-            </w14:solidFill>
-          </w14:textFill>
+          <w:color w:val="00A2FF"/>
         </w:rPr>
         <w:t>Project</w:t>
       </w:r>
@@ -116,34 +71,16 @@
           <w:rFonts w:ascii="Mj_Casablanca Light" w:hAnsi="Mj_Casablanca Light"/>
           <w:b w:val="0"/>
           <w:bCs w:val="0"/>
-          <w:outline w:val="0"/>
-          <w:color w:val="00a1fe"/>
-          <w:rtl w:val="0"/>
-          <w:lang w:val="en-US"/>
-          <w14:textFill>
-            <w14:solidFill>
-              <w14:srgbClr w14:val="00A2FF"/>
-            </w14:solidFill>
-          </w14:textFill>
+          <w:color w:val="00A2FF"/>
         </w:rPr>
         <w:t xml:space="preserve"> </w:t>
       </w:r>
       <w:r>
         <w:rPr>
-          <w:rFonts w:ascii="Arial Unicode MS" w:cs="Arial Unicode MS" w:hAnsi="Arial Unicode MS" w:eastAsia="Arial Unicode MS"/>
+          <w:rFonts w:cs="Arial Unicode MS"/>
           <w:b w:val="0"/>
           <w:bCs w:val="0"/>
-          <w:i w:val="0"/>
-          <w:iCs w:val="0"/>
-          <w:outline w:val="0"/>
-          <w:color w:val="00a1fe"/>
-          <w:rtl w:val="0"/>
-          <w:lang w:val="en-US"/>
-          <w14:textFill>
-            <w14:solidFill>
-              <w14:srgbClr w14:val="00A2FF"/>
-            </w14:solidFill>
-          </w14:textFill>
+          <w:color w:val="00A2FF"/>
         </w:rPr>
         <w:t>standards</w:t>
       </w:r>
@@ -151,58 +88,52 @@
     <w:tbl>
       <w:tblPr>
         <w:tblW w:w="9350" w:type="dxa"/>
-        <w:jc w:val="left"/>
         <w:tblInd w:w="108" w:type="dxa"/>
         <w:tblBorders>
-          <w:top w:val="single" w:color="929292" w:sz="4" w:space="0" w:shadow="0" w:frame="0"/>
-          <w:left w:val="single" w:color="929292" w:sz="4" w:space="0" w:shadow="0" w:frame="0"/>
-          <w:bottom w:val="single" w:color="929292" w:sz="4" w:space="0" w:shadow="0" w:frame="0"/>
-          <w:right w:val="single" w:color="929292" w:sz="4" w:space="0" w:shadow="0" w:frame="0"/>
-          <w:insideH w:val="single" w:color="929292" w:sz="4" w:space="0" w:shadow="0" w:frame="0"/>
-          <w:insideV w:val="single" w:color="929292" w:sz="4" w:space="0" w:shadow="0" w:frame="0"/>
+          <w:top w:val="single" w:sz="4" w:space="0" w:color="929292"/>
+          <w:left w:val="single" w:sz="4" w:space="0" w:color="929292"/>
+          <w:bottom w:val="single" w:sz="4" w:space="0" w:color="929292"/>
+          <w:right w:val="single" w:sz="4" w:space="0" w:color="929292"/>
+          <w:insideH w:val="single" w:sz="4" w:space="0" w:color="929292"/>
+          <w:insideV w:val="single" w:sz="4" w:space="0" w:color="929292"/>
         </w:tblBorders>
-        <w:shd w:val="clear" w:color="auto" w:fill="auto"/>
+        <w:shd w:val="clear" w:color="auto" w:fill="00A2FF"/>
         <w:tblLayout w:type="fixed"/>
+        <w:tblLook w:val="04A0" w:firstRow="1" w:lastRow="0" w:firstColumn="1" w:lastColumn="0" w:noHBand="0" w:noVBand="1"/>
       </w:tblPr>
       <w:tblGrid>
         <w:gridCol w:w="4675"/>
         <w:gridCol w:w="4675"/>
       </w:tblGrid>
       <w:tr>
-        <w:tblPrEx>
-          <w:shd w:val="clear" w:color="auto" w:fill="00a2ff"/>
-        </w:tblPrEx>
         <w:trPr>
-          <w:trHeight w:val="294" w:hRule="atLeast"/>
+          <w:trHeight w:val="294"/>
           <w:tblHeader/>
         </w:trPr>
         <w:tc>
           <w:tcPr>
-            <w:tcW w:type="dxa" w:w="4675"/>
+            <w:tcW w:w="4675" w:type="dxa"/>
             <w:tcBorders>
-              <w:top w:val="single" w:color="929292" w:sz="4" w:space="0" w:shadow="0" w:frame="0"/>
-              <w:left w:val="single" w:color="929292" w:sz="4" w:space="0" w:shadow="0" w:frame="0"/>
-              <w:bottom w:val="single" w:color="89847f" w:sz="8" w:space="0" w:shadow="0" w:frame="0"/>
-              <w:right w:val="single" w:color="ffffff" w:sz="4" w:space="0" w:shadow="0" w:frame="0"/>
+              <w:top w:val="single" w:sz="4" w:space="0" w:color="929292"/>
+              <w:left w:val="single" w:sz="4" w:space="0" w:color="929292"/>
+              <w:bottom w:val="single" w:sz="8" w:space="0" w:color="89847F"/>
+              <w:right w:val="single" w:sz="4" w:space="0" w:color="FFFFFF"/>
             </w:tcBorders>
-            <w:shd w:val="clear" w:color="auto" w:fill="00a2ff"/>
+            <w:shd w:val="clear" w:color="auto" w:fill="00A2FF"/>
             <w:tcMar>
-              <w:top w:type="dxa" w:w="80"/>
-              <w:left w:type="dxa" w:w="80"/>
-              <w:bottom w:type="dxa" w:w="80"/>
-              <w:right w:type="dxa" w:w="80"/>
+              <w:top w:w="80" w:type="dxa"/>
+              <w:left w:w="80" w:type="dxa"/>
+              <w:bottom w:w="80" w:type="dxa"/>
+              <w:right w:w="80" w:type="dxa"/>
             </w:tcMar>
-            <w:vAlign w:val="top"/>
           </w:tcPr>
           <w:p>
             <w:pPr>
-              <w:pStyle w:val="Table Style 3"/>
-              <w:bidi w:val="0"/>
+              <w:pStyle w:val="TableStyle3"/>
             </w:pPr>
             <w:r>
               <w:rPr>
-                <w:rFonts w:ascii="Helvetica Neue" w:cs="Arial Unicode MS" w:hAnsi="Helvetica Neue" w:eastAsia="Arial Unicode MS"/>
-                <w:rtl w:val="0"/>
+                <w:rFonts w:eastAsia="Arial Unicode MS" w:cs="Arial Unicode MS"/>
               </w:rPr>
               <w:t>Topic</w:t>
             </w:r>
@@ -210,31 +141,28 @@
         </w:tc>
         <w:tc>
           <w:tcPr>
-            <w:tcW w:type="dxa" w:w="4675"/>
+            <w:tcW w:w="4675" w:type="dxa"/>
             <w:tcBorders>
-              <w:top w:val="single" w:color="929292" w:sz="4" w:space="0" w:shadow="0" w:frame="0"/>
-              <w:left w:val="single" w:color="ffffff" w:sz="4" w:space="0" w:shadow="0" w:frame="0"/>
-              <w:bottom w:val="single" w:color="89847f" w:sz="8" w:space="0" w:shadow="0" w:frame="0"/>
-              <w:right w:val="single" w:color="929292" w:sz="4" w:space="0" w:shadow="0" w:frame="0"/>
+              <w:top w:val="single" w:sz="4" w:space="0" w:color="929292"/>
+              <w:left w:val="single" w:sz="4" w:space="0" w:color="FFFFFF"/>
+              <w:bottom w:val="single" w:sz="8" w:space="0" w:color="89847F"/>
+              <w:right w:val="single" w:sz="4" w:space="0" w:color="929292"/>
             </w:tcBorders>
-            <w:shd w:val="clear" w:color="auto" w:fill="00a2ff"/>
+            <w:shd w:val="clear" w:color="auto" w:fill="00A2FF"/>
             <w:tcMar>
-              <w:top w:type="dxa" w:w="80"/>
-              <w:left w:type="dxa" w:w="80"/>
-              <w:bottom w:type="dxa" w:w="80"/>
-              <w:right w:type="dxa" w:w="80"/>
+              <w:top w:w="80" w:type="dxa"/>
+              <w:left w:w="80" w:type="dxa"/>
+              <w:bottom w:w="80" w:type="dxa"/>
+              <w:right w:w="80" w:type="dxa"/>
             </w:tcMar>
-            <w:vAlign w:val="top"/>
           </w:tcPr>
           <w:p>
             <w:pPr>
-              <w:pStyle w:val="Table Style 3"/>
-              <w:bidi w:val="0"/>
+              <w:pStyle w:val="TableStyle3"/>
             </w:pPr>
             <w:r>
               <w:rPr>
-                <w:rFonts w:ascii="Helvetica Neue" w:cs="Arial Unicode MS" w:hAnsi="Helvetica Neue" w:eastAsia="Arial Unicode MS"/>
-                <w:rtl w:val="0"/>
+                <w:rFonts w:eastAsia="Arial Unicode MS" w:cs="Arial Unicode MS"/>
               </w:rPr>
               <w:t>Explanation</w:t>
             </w:r>
@@ -246,35 +174,31 @@
           <w:shd w:val="clear" w:color="auto" w:fill="auto"/>
         </w:tblPrEx>
         <w:trPr>
-          <w:trHeight w:val="1255" w:hRule="atLeast"/>
+          <w:trHeight w:val="1255"/>
         </w:trPr>
         <w:tc>
           <w:tcPr>
-            <w:tcW w:type="dxa" w:w="4675"/>
+            <w:tcW w:w="4675" w:type="dxa"/>
             <w:tcBorders>
-              <w:top w:val="single" w:color="89847f" w:sz="8" w:space="0" w:shadow="0" w:frame="0"/>
-              <w:left w:val="single" w:color="929292" w:sz="4" w:space="0" w:shadow="0" w:frame="0"/>
-              <w:bottom w:val="single" w:color="929292" w:sz="4" w:space="0" w:shadow="0" w:frame="0"/>
-              <w:right w:val="single" w:color="89847f" w:sz="8" w:space="0" w:shadow="0" w:frame="0"/>
+              <w:top w:val="single" w:sz="8" w:space="0" w:color="89847F"/>
+              <w:left w:val="single" w:sz="4" w:space="0" w:color="929292"/>
+              <w:bottom w:val="single" w:sz="4" w:space="0" w:color="929292"/>
+              <w:right w:val="single" w:sz="8" w:space="0" w:color="89847F"/>
             </w:tcBorders>
-            <w:shd w:val="clear" w:color="auto" w:fill="auto"/>
             <w:tcMar>
-              <w:top w:type="dxa" w:w="80"/>
-              <w:left w:type="dxa" w:w="80"/>
-              <w:bottom w:type="dxa" w:w="80"/>
-              <w:right w:type="dxa" w:w="80"/>
+              <w:top w:w="80" w:type="dxa"/>
+              <w:left w:w="80" w:type="dxa"/>
+              <w:bottom w:w="80" w:type="dxa"/>
+              <w:right w:w="80" w:type="dxa"/>
             </w:tcMar>
-            <w:vAlign w:val="top"/>
           </w:tcPr>
           <w:p>
             <w:pPr>
-              <w:pStyle w:val="Table Style 4"/>
-              <w:bidi w:val="0"/>
+              <w:pStyle w:val="TableStyle4"/>
             </w:pPr>
             <w:r>
               <w:rPr>
-                <w:rFonts w:ascii="Helvetica Neue Medium" w:cs="Arial Unicode MS" w:hAnsi="Helvetica Neue Medium" w:eastAsia="Arial Unicode MS"/>
-                <w:rtl w:val="0"/>
+                <w:rFonts w:eastAsia="Arial Unicode MS" w:cs="Arial Unicode MS"/>
               </w:rPr>
               <w:t>Documentation naming standard</w:t>
             </w:r>
@@ -282,72 +206,147 @@
         </w:tc>
         <w:tc>
           <w:tcPr>
-            <w:tcW w:type="dxa" w:w="4675"/>
+            <w:tcW w:w="4675" w:type="dxa"/>
             <w:tcBorders>
-              <w:top w:val="single" w:color="89847f" w:sz="8" w:space="0" w:shadow="0" w:frame="0"/>
-              <w:left w:val="single" w:color="89847f" w:sz="8" w:space="0" w:shadow="0" w:frame="0"/>
-              <w:bottom w:val="single" w:color="929292" w:sz="4" w:space="0" w:shadow="0" w:frame="0"/>
-              <w:right w:val="single" w:color="929292" w:sz="4" w:space="0" w:shadow="0" w:frame="0"/>
+              <w:top w:val="single" w:sz="8" w:space="0" w:color="89847F"/>
+              <w:left w:val="single" w:sz="8" w:space="0" w:color="89847F"/>
+              <w:bottom w:val="single" w:sz="4" w:space="0" w:color="929292"/>
+              <w:right w:val="single" w:sz="4" w:space="0" w:color="929292"/>
             </w:tcBorders>
-            <w:shd w:val="clear" w:color="auto" w:fill="auto"/>
             <w:tcMar>
-              <w:top w:type="dxa" w:w="80"/>
-              <w:left w:type="dxa" w:w="80"/>
-              <w:bottom w:type="dxa" w:w="80"/>
-              <w:right w:type="dxa" w:w="80"/>
+              <w:top w:w="80" w:type="dxa"/>
+              <w:left w:w="80" w:type="dxa"/>
+              <w:bottom w:w="80" w:type="dxa"/>
+              <w:right w:w="80" w:type="dxa"/>
             </w:tcMar>
-            <w:vAlign w:val="top"/>
           </w:tcPr>
           <w:p>
             <w:pPr>
-              <w:pStyle w:val="Table Style 2"/>
-              <w:bidi w:val="1"/>
-              <w:ind w:left="0" w:right="0" w:firstLine="0"/>
+              <w:pStyle w:val="TableStyle2"/>
+              <w:bidi/>
               <w:jc w:val="right"/>
               <w:rPr>
-                <w:rtl w:val="1"/>
+                <w:rtl/>
               </w:rPr>
             </w:pPr>
             <w:r>
               <w:rPr>
-                <w:rFonts w:ascii="Arial Unicode MS" w:cs="Helvetica Neue" w:hAnsi="Arial Unicode MS" w:eastAsia="Arial Unicode MS" w:hint="cs"/>
-                <w:rtl w:val="1"/>
-              </w:rPr>
-              <w:t>از این الگو پیروی میکند</w:t>
-            </w:r>
-            <w:r>
-              <w:rPr>
-                <w:rFonts w:ascii="Helvetica Neue" w:hAnsi="Helvetica Neue" w:hint="default"/>
-                <w:rtl w:val="1"/>
-              </w:rPr>
-              <w:br w:type="textWrapping"/>
-              <w:br w:type="textWrapping"/>
-              <w:br w:type="textWrapping"/>
-            </w:r>
-            <w:r>
-              <w:rPr>
-                <w:rFonts w:ascii="Helvetica Neue" w:hAnsi="Helvetica Neue"/>
-                <w:rtl w:val="0"/>
-              </w:rPr>
-              <w:t>FileName - {W / P / E} {V}{VersionNumber}</w:t>
+                <w:rFonts w:ascii="Arial Unicode MS" w:eastAsia="Arial Unicode MS" w:hAnsi="Arial Unicode MS" w:hint="cs"/>
+                <w:rtl/>
+              </w:rPr>
+              <w:t xml:space="preserve">از </w:t>
+            </w:r>
+            <w:proofErr w:type="spellStart"/>
+            <w:r>
+              <w:rPr>
+                <w:rFonts w:ascii="Arial Unicode MS" w:eastAsia="Arial Unicode MS" w:hAnsi="Arial Unicode MS" w:hint="cs"/>
+                <w:rtl/>
+              </w:rPr>
+              <w:t>این</w:t>
+            </w:r>
+            <w:proofErr w:type="spellEnd"/>
+            <w:r>
+              <w:rPr>
+                <w:rFonts w:ascii="Arial Unicode MS" w:eastAsia="Arial Unicode MS" w:hAnsi="Arial Unicode MS" w:hint="cs"/>
+                <w:rtl/>
+              </w:rPr>
+              <w:t xml:space="preserve"> </w:t>
+            </w:r>
+            <w:proofErr w:type="spellStart"/>
+            <w:r>
+              <w:rPr>
+                <w:rFonts w:ascii="Arial Unicode MS" w:eastAsia="Arial Unicode MS" w:hAnsi="Arial Unicode MS" w:hint="cs"/>
+                <w:rtl/>
+              </w:rPr>
+              <w:t>الگو</w:t>
+            </w:r>
+            <w:proofErr w:type="spellEnd"/>
+            <w:r>
+              <w:rPr>
+                <w:rFonts w:ascii="Arial Unicode MS" w:eastAsia="Arial Unicode MS" w:hAnsi="Arial Unicode MS" w:hint="cs"/>
+                <w:rtl/>
+              </w:rPr>
+              <w:t xml:space="preserve"> </w:t>
+            </w:r>
+            <w:proofErr w:type="spellStart"/>
+            <w:r>
+              <w:rPr>
+                <w:rFonts w:ascii="Arial Unicode MS" w:eastAsia="Arial Unicode MS" w:hAnsi="Arial Unicode MS" w:hint="cs"/>
+                <w:rtl/>
+              </w:rPr>
+              <w:t>پیروی</w:t>
+            </w:r>
+            <w:proofErr w:type="spellEnd"/>
+            <w:r>
+              <w:rPr>
+                <w:rFonts w:ascii="Arial Unicode MS" w:eastAsia="Arial Unicode MS" w:hAnsi="Arial Unicode MS" w:hint="cs"/>
+                <w:rtl/>
+              </w:rPr>
+              <w:t xml:space="preserve"> </w:t>
+            </w:r>
+            <w:proofErr w:type="spellStart"/>
+            <w:r>
+              <w:rPr>
+                <w:rFonts w:ascii="Arial Unicode MS" w:eastAsia="Arial Unicode MS" w:hAnsi="Arial Unicode MS" w:hint="cs"/>
+                <w:rtl/>
+              </w:rPr>
+              <w:t>میکند</w:t>
+            </w:r>
+            <w:proofErr w:type="spellEnd"/>
+            <w:r>
+              <w:rPr>
+                <w:rtl/>
+              </w:rPr>
+              <w:br/>
+            </w:r>
+            <w:r>
+              <w:rPr>
+                <w:rtl/>
+              </w:rPr>
+              <w:br/>
+            </w:r>
+            <w:r>
+              <w:rPr>
+                <w:rtl/>
+              </w:rPr>
+              <w:br/>
+            </w:r>
+            <w:proofErr w:type="spellStart"/>
+            <w:r>
+              <w:t>FileName</w:t>
+            </w:r>
+            <w:proofErr w:type="spellEnd"/>
+            <w:r>
+              <w:t xml:space="preserve"> - {W / P / E} {V}{</w:t>
+            </w:r>
+            <w:proofErr w:type="spellStart"/>
+            <w:r>
+              <w:t>VersionNumber</w:t>
+            </w:r>
+            <w:proofErr w:type="spellEnd"/>
+            <w:r>
+              <w:t>}</w:t>
             </w:r>
           </w:p>
           <w:p>
             <w:pPr>
-              <w:pStyle w:val="Table Style 2"/>
-              <w:bidi w:val="1"/>
-              <w:ind w:left="0" w:right="0" w:firstLine="0"/>
+              <w:pStyle w:val="TableStyle2"/>
+              <w:bidi/>
               <w:jc w:val="right"/>
               <w:rPr>
-                <w:rtl w:val="1"/>
+                <w:rtl/>
               </w:rPr>
             </w:pPr>
             <w:r>
-              <w:rPr>
-                <w:rFonts w:ascii="Helvetica Neue" w:hAnsi="Helvetica Neue"/>
-                <w:rtl w:val="0"/>
-              </w:rPr>
-              <w:t>W: Word, P: Pagges, E: Export</w:t>
+              <w:t xml:space="preserve">W: Word, P: </w:t>
+            </w:r>
+            <w:proofErr w:type="spellStart"/>
+            <w:r>
+              <w:t>Pagges</w:t>
+            </w:r>
+            <w:proofErr w:type="spellEnd"/>
+            <w:r>
+              <w:t>, E: Export</w:t>
             </w:r>
           </w:p>
         </w:tc>
@@ -357,35 +356,31 @@
           <w:shd w:val="clear" w:color="auto" w:fill="auto"/>
         </w:tblPrEx>
         <w:trPr>
-          <w:trHeight w:val="1204" w:hRule="atLeast"/>
+          <w:trHeight w:val="1204"/>
         </w:trPr>
         <w:tc>
           <w:tcPr>
-            <w:tcW w:type="dxa" w:w="4675"/>
+            <w:tcW w:w="4675" w:type="dxa"/>
             <w:tcBorders>
-              <w:top w:val="single" w:color="929292" w:sz="4" w:space="0" w:shadow="0" w:frame="0"/>
-              <w:left w:val="single" w:color="929292" w:sz="4" w:space="0" w:shadow="0" w:frame="0"/>
-              <w:bottom w:val="single" w:color="929292" w:sz="4" w:space="0" w:shadow="0" w:frame="0"/>
-              <w:right w:val="single" w:color="89847f" w:sz="8" w:space="0" w:shadow="0" w:frame="0"/>
+              <w:top w:val="single" w:sz="4" w:space="0" w:color="929292"/>
+              <w:left w:val="single" w:sz="4" w:space="0" w:color="929292"/>
+              <w:bottom w:val="single" w:sz="4" w:space="0" w:color="929292"/>
+              <w:right w:val="single" w:sz="8" w:space="0" w:color="89847F"/>
             </w:tcBorders>
-            <w:shd w:val="clear" w:color="auto" w:fill="auto"/>
             <w:tcMar>
-              <w:top w:type="dxa" w:w="80"/>
-              <w:left w:type="dxa" w:w="80"/>
-              <w:bottom w:type="dxa" w:w="80"/>
-              <w:right w:type="dxa" w:w="80"/>
+              <w:top w:w="80" w:type="dxa"/>
+              <w:left w:w="80" w:type="dxa"/>
+              <w:bottom w:w="80" w:type="dxa"/>
+              <w:right w:w="80" w:type="dxa"/>
             </w:tcMar>
-            <w:vAlign w:val="top"/>
           </w:tcPr>
           <w:p>
             <w:pPr>
-              <w:pStyle w:val="Table Style 4"/>
-              <w:bidi w:val="0"/>
+              <w:pStyle w:val="TableStyle4"/>
             </w:pPr>
             <w:r>
               <w:rPr>
-                <w:rFonts w:ascii="Helvetica Neue Medium" w:cs="Arial Unicode MS" w:hAnsi="Helvetica Neue Medium" w:eastAsia="Arial Unicode MS"/>
-                <w:rtl w:val="0"/>
+                <w:rFonts w:eastAsia="Arial Unicode MS" w:cs="Arial Unicode MS"/>
               </w:rPr>
               <w:t>Documentation type handling</w:t>
             </w:r>
@@ -393,56 +388,78 @@
         </w:tc>
         <w:tc>
           <w:tcPr>
-            <w:tcW w:type="dxa" w:w="4675"/>
+            <w:tcW w:w="4675" w:type="dxa"/>
             <w:tcBorders>
-              <w:top w:val="single" w:color="929292" w:sz="4" w:space="0" w:shadow="0" w:frame="0"/>
-              <w:left w:val="single" w:color="89847f" w:sz="8" w:space="0" w:shadow="0" w:frame="0"/>
-              <w:bottom w:val="single" w:color="929292" w:sz="4" w:space="0" w:shadow="0" w:frame="0"/>
-              <w:right w:val="single" w:color="929292" w:sz="4" w:space="0" w:shadow="0" w:frame="0"/>
+              <w:top w:val="single" w:sz="4" w:space="0" w:color="929292"/>
+              <w:left w:val="single" w:sz="8" w:space="0" w:color="89847F"/>
+              <w:bottom w:val="single" w:sz="4" w:space="0" w:color="929292"/>
+              <w:right w:val="single" w:sz="4" w:space="0" w:color="929292"/>
             </w:tcBorders>
-            <w:shd w:val="clear" w:color="auto" w:fill="f7f7f6"/>
+            <w:shd w:val="clear" w:color="auto" w:fill="F7F7F6"/>
             <w:tcMar>
-              <w:top w:type="dxa" w:w="80"/>
-              <w:left w:type="dxa" w:w="80"/>
-              <w:bottom w:type="dxa" w:w="80"/>
-              <w:right w:type="dxa" w:w="80"/>
+              <w:top w:w="80" w:type="dxa"/>
+              <w:left w:w="80" w:type="dxa"/>
+              <w:bottom w:w="80" w:type="dxa"/>
+              <w:right w:w="80" w:type="dxa"/>
             </w:tcMar>
-            <w:vAlign w:val="top"/>
           </w:tcPr>
           <w:p>
             <w:pPr>
-              <w:pStyle w:val="Table Style 2"/>
+              <w:pStyle w:val="TableStyle2"/>
               <w:numPr>
                 <w:ilvl w:val="0"/>
                 <w:numId w:val="1"/>
               </w:numPr>
-              <w:bidi w:val="0"/>
             </w:pPr>
             <w:r>
               <w:rPr>
-                <w:rFonts w:cs="Arial Unicode MS" w:eastAsia="Arial Unicode MS"/>
-                <w:rtl w:val="0"/>
-                <w:lang w:val="en-US"/>
-              </w:rPr>
-              <w:t>If working with Pages -&gt; make a  .docx and a .pdf versions of the latest changes with naming standards as above.</w:t>
+                <w:rFonts w:eastAsia="Arial Unicode MS" w:cs="Arial Unicode MS"/>
+              </w:rPr>
+              <w:t xml:space="preserve">If working with Pages -&gt; make </w:t>
+            </w:r>
+            <w:proofErr w:type="gramStart"/>
+            <w:r>
+              <w:rPr>
+                <w:rFonts w:eastAsia="Arial Unicode MS" w:cs="Arial Unicode MS"/>
+              </w:rPr>
+              <w:t>a  .</w:t>
+            </w:r>
+            <w:proofErr w:type="gramEnd"/>
+            <w:r>
+              <w:rPr>
+                <w:rFonts w:eastAsia="Arial Unicode MS" w:cs="Arial Unicode MS"/>
+              </w:rPr>
+              <w:t>docx and a .pdf versions of the latest changes with naming standards as above.</w:t>
             </w:r>
           </w:p>
           <w:p>
             <w:pPr>
-              <w:pStyle w:val="Table Style 2"/>
+              <w:pStyle w:val="TableStyle2"/>
               <w:numPr>
                 <w:ilvl w:val="0"/>
                 <w:numId w:val="1"/>
               </w:numPr>
-              <w:bidi w:val="0"/>
             </w:pPr>
             <w:r>
               <w:rPr>
-                <w:rFonts w:cs="Arial Unicode MS" w:eastAsia="Arial Unicode MS"/>
-                <w:rtl w:val="0"/>
-                <w:lang w:val="en-US"/>
+                <w:rFonts w:eastAsia="Arial Unicode MS" w:cs="Arial Unicode MS"/>
               </w:rPr>
               <w:t>If working with Word -&gt; make a .pdf version of it with naming standards as above.</w:t>
+            </w:r>
+          </w:p>
+          <w:p>
+            <w:pPr>
+              <w:pStyle w:val="TableStyle2"/>
+              <w:numPr>
+                <w:ilvl w:val="0"/>
+                <w:numId w:val="1"/>
+              </w:numPr>
+            </w:pPr>
+            <w:r>
+              <w:rPr>
+                <w:rFonts w:eastAsia="Arial Unicode MS" w:cs="Arial Unicode MS"/>
+              </w:rPr>
+              <w:t>Making PDF is better view, not required.</w:t>
             </w:r>
           </w:p>
         </w:tc>
@@ -452,47 +469,155 @@
           <w:shd w:val="clear" w:color="auto" w:fill="auto"/>
         </w:tblPrEx>
         <w:trPr>
-          <w:trHeight w:val="294" w:hRule="atLeast"/>
+          <w:trHeight w:val="294"/>
         </w:trPr>
         <w:tc>
           <w:tcPr>
-            <w:tcW w:type="dxa" w:w="4675"/>
+            <w:tcW w:w="4675" w:type="dxa"/>
             <w:tcBorders>
-              <w:top w:val="single" w:color="929292" w:sz="4" w:space="0" w:shadow="0" w:frame="0"/>
-              <w:left w:val="single" w:color="929292" w:sz="4" w:space="0" w:shadow="0" w:frame="0"/>
-              <w:bottom w:val="single" w:color="929292" w:sz="4" w:space="0" w:shadow="0" w:frame="0"/>
-              <w:right w:val="single" w:color="89847f" w:sz="8" w:space="0" w:shadow="0" w:frame="0"/>
+              <w:top w:val="single" w:sz="4" w:space="0" w:color="929292"/>
+              <w:left w:val="single" w:sz="4" w:space="0" w:color="929292"/>
+              <w:bottom w:val="single" w:sz="4" w:space="0" w:color="929292"/>
+              <w:right w:val="single" w:sz="8" w:space="0" w:color="89847F"/>
             </w:tcBorders>
-            <w:shd w:val="clear" w:color="auto" w:fill="auto"/>
             <w:tcMar>
-              <w:top w:type="dxa" w:w="80"/>
-              <w:left w:type="dxa" w:w="80"/>
-              <w:bottom w:type="dxa" w:w="80"/>
-              <w:right w:type="dxa" w:w="80"/>
+              <w:top w:w="80" w:type="dxa"/>
+              <w:left w:w="80" w:type="dxa"/>
+              <w:bottom w:w="80" w:type="dxa"/>
+              <w:right w:w="80" w:type="dxa"/>
             </w:tcMar>
-            <w:vAlign w:val="top"/>
           </w:tcPr>
-          <w:p/>
+          <w:p>
+            <w:pPr>
+              <w:bidi/>
+              <w:rPr>
+                <w:rFonts w:ascii="Helvetica Neue" w:hAnsi="Helvetica Neue"/>
+                <w:rtl/>
+                <w:lang w:bidi="fa-IR"/>
+              </w:rPr>
+            </w:pPr>
+            <w:r>
+              <w:rPr>
+                <w:rFonts w:ascii="Helvetica Neue" w:hAnsi="Helvetica Neue" w:hint="cs"/>
+                <w:rtl/>
+                <w:lang w:bidi="fa-IR"/>
+              </w:rPr>
+              <w:t xml:space="preserve">اشاره به </w:t>
+            </w:r>
+            <w:proofErr w:type="spellStart"/>
+            <w:r>
+              <w:rPr>
+                <w:rFonts w:ascii="Helvetica Neue" w:hAnsi="Helvetica Neue" w:hint="cs"/>
+                <w:rtl/>
+                <w:lang w:bidi="fa-IR"/>
+              </w:rPr>
+              <w:t>تسکی</w:t>
+            </w:r>
+            <w:proofErr w:type="spellEnd"/>
+            <w:r>
+              <w:rPr>
+                <w:rFonts w:ascii="Helvetica Neue" w:hAnsi="Helvetica Neue" w:hint="cs"/>
+                <w:rtl/>
+                <w:lang w:bidi="fa-IR"/>
+              </w:rPr>
+              <w:t xml:space="preserve"> از </w:t>
+            </w:r>
+            <w:r>
+              <w:rPr>
+                <w:rFonts w:ascii="Helvetica Neue" w:hAnsi="Helvetica Neue"/>
+                <w:lang w:bidi="fa-IR"/>
+              </w:rPr>
+              <w:t>WBS</w:t>
+            </w:r>
+          </w:p>
         </w:tc>
         <w:tc>
           <w:tcPr>
-            <w:tcW w:type="dxa" w:w="4675"/>
+            <w:tcW w:w="4675" w:type="dxa"/>
             <w:tcBorders>
-              <w:top w:val="single" w:color="929292" w:sz="4" w:space="0" w:shadow="0" w:frame="0"/>
-              <w:left w:val="single" w:color="89847f" w:sz="8" w:space="0" w:shadow="0" w:frame="0"/>
-              <w:bottom w:val="single" w:color="929292" w:sz="4" w:space="0" w:shadow="0" w:frame="0"/>
-              <w:right w:val="single" w:color="929292" w:sz="4" w:space="0" w:shadow="0" w:frame="0"/>
+              <w:top w:val="single" w:sz="4" w:space="0" w:color="929292"/>
+              <w:left w:val="single" w:sz="8" w:space="0" w:color="89847F"/>
+              <w:bottom w:val="single" w:sz="4" w:space="0" w:color="929292"/>
+              <w:right w:val="single" w:sz="4" w:space="0" w:color="929292"/>
             </w:tcBorders>
-            <w:shd w:val="clear" w:color="auto" w:fill="auto"/>
             <w:tcMar>
-              <w:top w:type="dxa" w:w="80"/>
-              <w:left w:type="dxa" w:w="80"/>
-              <w:bottom w:type="dxa" w:w="80"/>
-              <w:right w:type="dxa" w:w="80"/>
+              <w:top w:w="80" w:type="dxa"/>
+              <w:left w:w="80" w:type="dxa"/>
+              <w:bottom w:w="80" w:type="dxa"/>
+              <w:right w:w="80" w:type="dxa"/>
             </w:tcMar>
-            <w:vAlign w:val="top"/>
           </w:tcPr>
-          <w:p/>
+          <w:p>
+            <w:pPr>
+              <w:bidi/>
+              <w:rPr>
+                <w:rFonts w:ascii="Helvetica Neue" w:hAnsi="Helvetica Neue"/>
+              </w:rPr>
+            </w:pPr>
+            <w:r>
+              <w:rPr>
+                <w:rFonts w:ascii="Helvetica Neue" w:hAnsi="Helvetica Neue" w:hint="cs"/>
+                <w:rtl/>
+                <w:lang w:bidi="fa-IR"/>
+              </w:rPr>
+              <w:t>مثال:</w:t>
+            </w:r>
+            <w:r>
+              <w:rPr>
+                <w:rFonts w:ascii="Helvetica Neue" w:hAnsi="Helvetica Neue"/>
+                <w:rtl/>
+                <w:lang w:bidi="fa-IR"/>
+              </w:rPr>
+              <w:br/>
+            </w:r>
+            <w:r>
+              <w:rPr>
+                <w:rFonts w:ascii="Helvetica Neue" w:hAnsi="Helvetica Neue"/>
+                <w:lang w:bidi="fa-IR"/>
+              </w:rPr>
+              <w:t>WBS-12</w:t>
+            </w:r>
+            <w:r>
+              <w:rPr>
+                <w:rFonts w:ascii="Helvetica Neue" w:hAnsi="Helvetica Neue" w:hint="cs"/>
+                <w:rtl/>
+                <w:lang w:bidi="fa-IR"/>
+              </w:rPr>
+              <w:t xml:space="preserve"> یعنی اشاره به </w:t>
+            </w:r>
+            <w:proofErr w:type="spellStart"/>
+            <w:r>
+              <w:rPr>
+                <w:rFonts w:ascii="Helvetica Neue" w:hAnsi="Helvetica Neue" w:hint="cs"/>
+                <w:rtl/>
+                <w:lang w:bidi="fa-IR"/>
+              </w:rPr>
+              <w:t>تسک</w:t>
+            </w:r>
+            <w:proofErr w:type="spellEnd"/>
+            <w:r>
+              <w:rPr>
+                <w:rFonts w:ascii="Helvetica Neue" w:hAnsi="Helvetica Neue" w:hint="cs"/>
+                <w:rtl/>
+                <w:lang w:bidi="fa-IR"/>
+              </w:rPr>
+              <w:t xml:space="preserve"> شماره ۱۲ از </w:t>
+            </w:r>
+            <w:r>
+              <w:rPr>
+                <w:rFonts w:ascii="Helvetica Neue" w:hAnsi="Helvetica Neue"/>
+                <w:lang w:bidi="fa-IR"/>
+              </w:rPr>
+              <w:t>WBS</w:t>
+            </w:r>
+            <w:r>
+              <w:rPr>
+                <w:rFonts w:ascii="Helvetica Neue" w:hAnsi="Helvetica Neue" w:hint="cs"/>
+                <w:rtl/>
+              </w:rPr>
+              <w:t xml:space="preserve"> </w:t>
+            </w:r>
+          </w:p>
         </w:tc>
       </w:tr>
       <w:tr>
@@ -500,91 +625,134 @@
           <w:shd w:val="clear" w:color="auto" w:fill="auto"/>
         </w:tblPrEx>
         <w:trPr>
-          <w:trHeight w:val="294" w:hRule="atLeast"/>
+          <w:trHeight w:val="294"/>
         </w:trPr>
         <w:tc>
           <w:tcPr>
-            <w:tcW w:type="dxa" w:w="4675"/>
+            <w:tcW w:w="4675" w:type="dxa"/>
             <w:tcBorders>
-              <w:top w:val="single" w:color="929292" w:sz="4" w:space="0" w:shadow="0" w:frame="0"/>
-              <w:left w:val="single" w:color="929292" w:sz="4" w:space="0" w:shadow="0" w:frame="0"/>
-              <w:bottom w:val="single" w:color="929292" w:sz="4" w:space="0" w:shadow="0" w:frame="0"/>
-              <w:right w:val="single" w:color="89847f" w:sz="8" w:space="0" w:shadow="0" w:frame="0"/>
+              <w:top w:val="single" w:sz="4" w:space="0" w:color="929292"/>
+              <w:left w:val="single" w:sz="4" w:space="0" w:color="929292"/>
+              <w:bottom w:val="single" w:sz="4" w:space="0" w:color="929292"/>
+              <w:right w:val="single" w:sz="8" w:space="0" w:color="89847F"/>
             </w:tcBorders>
-            <w:shd w:val="clear" w:color="auto" w:fill="auto"/>
             <w:tcMar>
-              <w:top w:type="dxa" w:w="80"/>
-              <w:left w:type="dxa" w:w="80"/>
-              <w:bottom w:type="dxa" w:w="80"/>
-              <w:right w:type="dxa" w:w="80"/>
+              <w:top w:w="80" w:type="dxa"/>
+              <w:left w:w="80" w:type="dxa"/>
+              <w:bottom w:w="80" w:type="dxa"/>
+              <w:right w:w="80" w:type="dxa"/>
             </w:tcMar>
-            <w:vAlign w:val="top"/>
           </w:tcPr>
-          <w:p/>
+          <w:p>
+            <w:pPr>
+              <w:rPr>
+                <w:rFonts w:ascii="Helvetica Neue" w:hAnsi="Helvetica Neue"/>
+              </w:rPr>
+            </w:pPr>
+          </w:p>
         </w:tc>
         <w:tc>
           <w:tcPr>
-            <w:tcW w:type="dxa" w:w="4675"/>
+            <w:tcW w:w="4675" w:type="dxa"/>
             <w:tcBorders>
-              <w:top w:val="single" w:color="929292" w:sz="4" w:space="0" w:shadow="0" w:frame="0"/>
-              <w:left w:val="single" w:color="89847f" w:sz="8" w:space="0" w:shadow="0" w:frame="0"/>
-              <w:bottom w:val="single" w:color="929292" w:sz="4" w:space="0" w:shadow="0" w:frame="0"/>
-              <w:right w:val="single" w:color="929292" w:sz="4" w:space="0" w:shadow="0" w:frame="0"/>
+              <w:top w:val="single" w:sz="4" w:space="0" w:color="929292"/>
+              <w:left w:val="single" w:sz="8" w:space="0" w:color="89847F"/>
+              <w:bottom w:val="single" w:sz="4" w:space="0" w:color="929292"/>
+              <w:right w:val="single" w:sz="4" w:space="0" w:color="929292"/>
             </w:tcBorders>
-            <w:shd w:val="clear" w:color="auto" w:fill="f7f7f6"/>
+            <w:shd w:val="clear" w:color="auto" w:fill="F7F7F6"/>
             <w:tcMar>
-              <w:top w:type="dxa" w:w="80"/>
-              <w:left w:type="dxa" w:w="80"/>
-              <w:bottom w:type="dxa" w:w="80"/>
-              <w:right w:type="dxa" w:w="80"/>
+              <w:top w:w="80" w:type="dxa"/>
+              <w:left w:w="80" w:type="dxa"/>
+              <w:bottom w:w="80" w:type="dxa"/>
+              <w:right w:w="80" w:type="dxa"/>
             </w:tcMar>
-            <w:vAlign w:val="top"/>
           </w:tcPr>
-          <w:p/>
+          <w:p>
+            <w:pPr>
+              <w:rPr>
+                <w:rFonts w:ascii="Helvetica Neue" w:hAnsi="Helvetica Neue"/>
+              </w:rPr>
+            </w:pPr>
+          </w:p>
         </w:tc>
       </w:tr>
     </w:tbl>
     <w:p>
       <w:pPr>
         <w:pStyle w:val="Body"/>
-        <w:bidi w:val="0"/>
+        <w:rPr>
+          <w:rFonts w:ascii="Helvetica Neue" w:hAnsi="Helvetica Neue" w:hint="default"/>
+        </w:rPr>
       </w:pPr>
     </w:p>
     <w:sectPr>
-      <w:headerReference w:type="default" r:id="rId4"/>
-      <w:footerReference w:type="default" r:id="rId5"/>
-      <w:pgSz w:w="12240" w:h="15840" w:orient="portrait"/>
-      <w:pgMar w:top="1440" w:right="1440" w:bottom="1440" w:left="1440" w:header="720" w:footer="864"/>
-      <w:bidi w:val="0"/>
+      <w:headerReference w:type="default" r:id="rId7"/>
+      <w:pgSz w:w="12240" w:h="15840"/>
+      <w:pgMar w:top="1440" w:right="1440" w:bottom="1440" w:left="1440" w:header="720" w:footer="864" w:gutter="0"/>
+      <w:cols w:space="720"/>
     </w:sectPr>
   </w:body>
 </w:document>
 </file>
 
-<file path=word/footer1.xml><?xml version="1.0" encoding="utf-8"?>
-<w:ftr xmlns:r="http://schemas.openxmlformats.org/officeDocument/2006/relationships" xmlns:wp="http://schemas.openxmlformats.org/drawingml/2006/wordprocessingDrawing" xmlns:w="http://schemas.openxmlformats.org/wordprocessingml/2006/main" xmlns:w10="urn:schemas-microsoft-com:office:word" xmlns:w14="http://schemas.microsoft.com/office/word/2010/wordml" xmlns:wps="http://schemas.microsoft.com/office/word/2010/wordprocessingShape" xmlns:wpg="http://schemas.microsoft.com/office/word/2010/wordprocessingGroup" xmlns:mc="http://schemas.openxmlformats.org/markup-compatibility/2006" xmlns:v="urn:schemas-microsoft-com:vml" xmlns:o="urn:schemas-microsoft-com:office:office" xmlns:m="http://schemas.openxmlformats.org/officeDocument/2006/math" mc:Ignorable="w14">
-  <w:p>
-    <w:r/>
-  </w:p>
-</w:ftr>
+<file path=word/endnotes.xml><?xml version="1.0" encoding="utf-8"?>
+<w:endnotes xmlns:wpc="http://schemas.microsoft.com/office/word/2010/wordprocessingCanvas" xmlns:cx="http://schemas.microsoft.com/office/drawing/2014/chartex" xmlns:cx1="http://schemas.microsoft.com/office/drawing/2015/9/8/chartex" xmlns:cx2="http://schemas.microsoft.com/office/drawing/2015/10/21/chartex" xmlns:cx3="http://schemas.microsoft.com/office/drawing/2016/5/9/chartex" xmlns:cx4="http://schemas.microsoft.com/office/drawing/2016/5/10/chartex" xmlns:cx5="http://schemas.microsoft.com/office/drawing/2016/5/11/chartex" xmlns:cx6="http://schemas.microsoft.com/office/drawing/2016/5/12/chartex" xmlns:cx7="http://schemas.microsoft.com/office/drawing/2016/5/13/chartex" xmlns:cx8="http://schemas.microsoft.com/office/drawing/2016/5/14/chartex" xmlns:mc="http://schemas.openxmlformats.org/markup-compatibility/2006" xmlns:aink="http://schemas.microsoft.com/office/drawing/2016/ink" xmlns:am3d="http://schemas.microsoft.com/office/drawing/2017/model3d" xmlns:o="urn:schemas-microsoft-com:office:office" xmlns:oel="http://schemas.microsoft.com/office/2019/extlst" xmlns:r="http://schemas.openxmlformats.org/officeDocument/2006/relationships" xmlns:m="http://schemas.openxmlformats.org/officeDocument/2006/math" xmlns:v="urn:schemas-microsoft-com:vml" xmlns:wp14="http://schemas.microsoft.com/office/word/2010/wordprocessingDrawing" xmlns:wp="http://schemas.openxmlformats.org/drawingml/2006/wordprocessingDrawing" xmlns:w10="urn:schemas-microsoft-com:office:word" xmlns:w="http://schemas.openxmlformats.org/wordprocessingml/2006/main" xmlns:w14="http://schemas.microsoft.com/office/word/2010/wordml" xmlns:w15="http://schemas.microsoft.com/office/word/2012/wordml" xmlns:w16cex="http://schemas.microsoft.com/office/word/2018/wordml/cex" xmlns:w16cid="http://schemas.microsoft.com/office/word/2016/wordml/cid" xmlns:w16="http://schemas.microsoft.com/office/word/2018/wordml" xmlns:w16du="http://schemas.microsoft.com/office/word/2023/wordml/word16du" xmlns:w16sdtdh="http://schemas.microsoft.com/office/word/2020/wordml/sdtdatahash" xmlns:w16sdtfl="http://schemas.microsoft.com/office/word/2024/wordml/sdtformatlock" xmlns:w16se="http://schemas.microsoft.com/office/word/2015/wordml/symex" xmlns:wpg="http://schemas.microsoft.com/office/word/2010/wordprocessingGroup" xmlns:wpi="http://schemas.microsoft.com/office/word/2010/wordprocessingInk" xmlns:wne="http://schemas.microsoft.com/office/word/2006/wordml" xmlns:wps="http://schemas.microsoft.com/office/word/2010/wordprocessingShape" mc:Ignorable="w14 w15 w16se w16cid w16 w16cex w16sdtdh w16sdtfl w16du wp14">
+  <w:endnote w:type="separator" w:id="-1">
+    <w:p>
+      <w:r>
+        <w:separator/>
+      </w:r>
+    </w:p>
+  </w:endnote>
+  <w:endnote w:type="continuationSeparator" w:id="0">
+    <w:p>
+      <w:r>
+        <w:continuationSeparator/>
+      </w:r>
+    </w:p>
+  </w:endnote>
+</w:endnotes>
+</file>
+
+<file path=word/footnotes.xml><?xml version="1.0" encoding="utf-8"?>
+<w:footnotes xmlns:wpc="http://schemas.microsoft.com/office/word/2010/wordprocessingCanvas" xmlns:cx="http://schemas.microsoft.com/office/drawing/2014/chartex" xmlns:cx1="http://schemas.microsoft.com/office/drawing/2015/9/8/chartex" xmlns:cx2="http://schemas.microsoft.com/office/drawing/2015/10/21/chartex" xmlns:cx3="http://schemas.microsoft.com/office/drawing/2016/5/9/chartex" xmlns:cx4="http://schemas.microsoft.com/office/drawing/2016/5/10/chartex" xmlns:cx5="http://schemas.microsoft.com/office/drawing/2016/5/11/chartex" xmlns:cx6="http://schemas.microsoft.com/office/drawing/2016/5/12/chartex" xmlns:cx7="http://schemas.microsoft.com/office/drawing/2016/5/13/chartex" xmlns:cx8="http://schemas.microsoft.com/office/drawing/2016/5/14/chartex" xmlns:mc="http://schemas.openxmlformats.org/markup-compatibility/2006" xmlns:aink="http://schemas.microsoft.com/office/drawing/2016/ink" xmlns:am3d="http://schemas.microsoft.com/office/drawing/2017/model3d" xmlns:o="urn:schemas-microsoft-com:office:office" xmlns:oel="http://schemas.microsoft.com/office/2019/extlst" xmlns:r="http://schemas.openxmlformats.org/officeDocument/2006/relationships" xmlns:m="http://schemas.openxmlformats.org/officeDocument/2006/math" xmlns:v="urn:schemas-microsoft-com:vml" xmlns:wp14="http://schemas.microsoft.com/office/word/2010/wordprocessingDrawing" xmlns:wp="http://schemas.openxmlformats.org/drawingml/2006/wordprocessingDrawing" xmlns:w10="urn:schemas-microsoft-com:office:word" xmlns:w="http://schemas.openxmlformats.org/wordprocessingml/2006/main" xmlns:w14="http://schemas.microsoft.com/office/word/2010/wordml" xmlns:w15="http://schemas.microsoft.com/office/word/2012/wordml" xmlns:w16cex="http://schemas.microsoft.com/office/word/2018/wordml/cex" xmlns:w16cid="http://schemas.microsoft.com/office/word/2016/wordml/cid" xmlns:w16="http://schemas.microsoft.com/office/word/2018/wordml" xmlns:w16du="http://schemas.microsoft.com/office/word/2023/wordml/word16du" xmlns:w16sdtdh="http://schemas.microsoft.com/office/word/2020/wordml/sdtdatahash" xmlns:w16sdtfl="http://schemas.microsoft.com/office/word/2024/wordml/sdtformatlock" xmlns:w16se="http://schemas.microsoft.com/office/word/2015/wordml/symex" xmlns:wpg="http://schemas.microsoft.com/office/word/2010/wordprocessingGroup" xmlns:wpi="http://schemas.microsoft.com/office/word/2010/wordprocessingInk" xmlns:wne="http://schemas.microsoft.com/office/word/2006/wordml" xmlns:wps="http://schemas.microsoft.com/office/word/2010/wordprocessingShape" mc:Ignorable="w14 w15 w16se w16cid w16 w16cex w16sdtdh w16sdtfl w16du wp14">
+  <w:footnote w:type="separator" w:id="-1">
+    <w:p>
+      <w:r>
+        <w:separator/>
+      </w:r>
+    </w:p>
+  </w:footnote>
+  <w:footnote w:type="continuationSeparator" w:id="0">
+    <w:p>
+      <w:r>
+        <w:continuationSeparator/>
+      </w:r>
+    </w:p>
+  </w:footnote>
+</w:footnotes>
 </file>
 
 <file path=word/header1.xml><?xml version="1.0" encoding="utf-8"?>
-<w:hdr xmlns:r="http://schemas.openxmlformats.org/officeDocument/2006/relationships" xmlns:wp="http://schemas.openxmlformats.org/drawingml/2006/wordprocessingDrawing" xmlns:w="http://schemas.openxmlformats.org/wordprocessingml/2006/main" xmlns:w10="urn:schemas-microsoft-com:office:word" xmlns:w14="http://schemas.microsoft.com/office/word/2010/wordml" xmlns:wps="http://schemas.microsoft.com/office/word/2010/wordprocessingShape" xmlns:wpg="http://schemas.microsoft.com/office/word/2010/wordprocessingGroup" xmlns:mc="http://schemas.openxmlformats.org/markup-compatibility/2006" xmlns:v="urn:schemas-microsoft-com:vml" xmlns:o="urn:schemas-microsoft-com:office:office" xmlns:m="http://schemas.openxmlformats.org/officeDocument/2006/math" mc:Ignorable="w14">
+<w:hdr xmlns:wpc="http://schemas.microsoft.com/office/word/2010/wordprocessingCanvas" xmlns:cx="http://schemas.microsoft.com/office/drawing/2014/chartex" xmlns:cx1="http://schemas.microsoft.com/office/drawing/2015/9/8/chartex" xmlns:cx2="http://schemas.microsoft.com/office/drawing/2015/10/21/chartex" xmlns:cx3="http://schemas.microsoft.com/office/drawing/2016/5/9/chartex" xmlns:cx4="http://schemas.microsoft.com/office/drawing/2016/5/10/chartex" xmlns:cx5="http://schemas.microsoft.com/office/drawing/2016/5/11/chartex" xmlns:cx6="http://schemas.microsoft.com/office/drawing/2016/5/12/chartex" xmlns:cx7="http://schemas.microsoft.com/office/drawing/2016/5/13/chartex" xmlns:cx8="http://schemas.microsoft.com/office/drawing/2016/5/14/chartex" xmlns:mc="http://schemas.openxmlformats.org/markup-compatibility/2006" xmlns:aink="http://schemas.microsoft.com/office/drawing/2016/ink" xmlns:am3d="http://schemas.microsoft.com/office/drawing/2017/model3d" xmlns:o="urn:schemas-microsoft-com:office:office" xmlns:oel="http://schemas.microsoft.com/office/2019/extlst" xmlns:r="http://schemas.openxmlformats.org/officeDocument/2006/relationships" xmlns:m="http://schemas.openxmlformats.org/officeDocument/2006/math" xmlns:v="urn:schemas-microsoft-com:vml" xmlns:wp14="http://schemas.microsoft.com/office/word/2010/wordprocessingDrawing" xmlns:wp="http://schemas.openxmlformats.org/drawingml/2006/wordprocessingDrawing" xmlns:w10="urn:schemas-microsoft-com:office:word" xmlns:w="http://schemas.openxmlformats.org/wordprocessingml/2006/main" xmlns:w14="http://schemas.microsoft.com/office/word/2010/wordml" xmlns:w15="http://schemas.microsoft.com/office/word/2012/wordml" xmlns:w16cex="http://schemas.microsoft.com/office/word/2018/wordml/cex" xmlns:w16cid="http://schemas.microsoft.com/office/word/2016/wordml/cid" xmlns:w16="http://schemas.microsoft.com/office/word/2018/wordml" xmlns:w16du="http://schemas.microsoft.com/office/word/2023/wordml/word16du" xmlns:w16sdtdh="http://schemas.microsoft.com/office/word/2020/wordml/sdtdatahash" xmlns:w16sdtfl="http://schemas.microsoft.com/office/word/2024/wordml/sdtformatlock" xmlns:w16se="http://schemas.microsoft.com/office/word/2015/wordml/symex" xmlns:wpg="http://schemas.microsoft.com/office/word/2010/wordprocessingGroup" xmlns:wpi="http://schemas.microsoft.com/office/word/2010/wordprocessingInk" xmlns:wne="http://schemas.microsoft.com/office/word/2006/wordml" xmlns:wps="http://schemas.microsoft.com/office/word/2010/wordprocessingShape" mc:Ignorable="w14 w15 w16se w16cid w16 w16cex w16sdtdh w16sdtfl w16du wp14">
   <w:p>
-    <w:r/>
+    <w:r>
+      <w:t>1404/01/27</w:t>
+    </w:r>
   </w:p>
 </w:hdr>
 </file>
 
 <file path=word/numbering.xml><?xml version="1.0" encoding="utf-8"?>
-<w:numbering xmlns:w="http://schemas.openxmlformats.org/wordprocessingml/2006/main" xmlns:wp="http://schemas.openxmlformats.org/drawingml/2006/wordprocessingDrawing" xmlns:w14="http://schemas.microsoft.com/office/word/2010/wordml" xmlns:r="http://schemas.openxmlformats.org/officeDocument/2006/relationships" xmlns:v="urn:schemas-microsoft-com:vml" xmlns:o="urn:schemas-microsoft-com:office:office">
-  <w:abstractNum w:abstractNumId="0">
+<w:numbering xmlns:wpc="http://schemas.microsoft.com/office/word/2010/wordprocessingCanvas" xmlns:cx="http://schemas.microsoft.com/office/drawing/2014/chartex" xmlns:cx1="http://schemas.microsoft.com/office/drawing/2015/9/8/chartex" xmlns:cx2="http://schemas.microsoft.com/office/drawing/2015/10/21/chartex" xmlns:cx3="http://schemas.microsoft.com/office/drawing/2016/5/9/chartex" xmlns:cx4="http://schemas.microsoft.com/office/drawing/2016/5/10/chartex" xmlns:cx5="http://schemas.microsoft.com/office/drawing/2016/5/11/chartex" xmlns:cx6="http://schemas.microsoft.com/office/drawing/2016/5/12/chartex" xmlns:cx7="http://schemas.microsoft.com/office/drawing/2016/5/13/chartex" xmlns:cx8="http://schemas.microsoft.com/office/drawing/2016/5/14/chartex" xmlns:mc="http://schemas.openxmlformats.org/markup-compatibility/2006" xmlns:aink="http://schemas.microsoft.com/office/drawing/2016/ink" xmlns:am3d="http://schemas.microsoft.com/office/drawing/2017/model3d" xmlns:o="urn:schemas-microsoft-com:office:office" xmlns:oel="http://schemas.microsoft.com/office/2019/extlst" xmlns:r="http://schemas.openxmlformats.org/officeDocument/2006/relationships" xmlns:m="http://schemas.openxmlformats.org/officeDocument/2006/math" xmlns:v="urn:schemas-microsoft-com:vml" xmlns:wp14="http://schemas.microsoft.com/office/word/2010/wordprocessingDrawing" xmlns:wp="http://schemas.openxmlformats.org/drawingml/2006/wordprocessingDrawing" xmlns:w10="urn:schemas-microsoft-com:office:word" xmlns:w="http://schemas.openxmlformats.org/wordprocessingml/2006/main" xmlns:w14="http://schemas.microsoft.com/office/word/2010/wordml" xmlns:w15="http://schemas.microsoft.com/office/word/2012/wordml" xmlns:w16cex="http://schemas.microsoft.com/office/word/2018/wordml/cex" xmlns:w16cid="http://schemas.microsoft.com/office/word/2016/wordml/cid" xmlns:w16="http://schemas.microsoft.com/office/word/2018/wordml" xmlns:w16du="http://schemas.microsoft.com/office/word/2023/wordml/word16du" xmlns:w16sdtdh="http://schemas.microsoft.com/office/word/2020/wordml/sdtdatahash" xmlns:w16sdtfl="http://schemas.microsoft.com/office/word/2024/wordml/sdtformatlock" xmlns:w16se="http://schemas.microsoft.com/office/word/2015/wordml/symex" xmlns:wpg="http://schemas.microsoft.com/office/word/2010/wordprocessingGroup" xmlns:wpi="http://schemas.microsoft.com/office/word/2010/wordprocessingInk" xmlns:wne="http://schemas.microsoft.com/office/word/2006/wordml" xmlns:wps="http://schemas.microsoft.com/office/word/2010/wordprocessingShape" mc:Ignorable="w14 w15 w16se w16cid w16 w16cex w16sdtdh w16sdtfl w16du wp14">
+  <w:abstractNum w:abstractNumId="0" w15:restartNumberingAfterBreak="0">
+    <w:nsid w:val="093E3656"/>
     <w:multiLevelType w:val="hybridMultilevel"/>
-    <w:lvl w:ilvl="0">
+    <w:tmpl w:val="928A4D8A"/>
+    <w:lvl w:ilvl="0" w:tplc="324CF624">
       <w:start w:val="1"/>
       <w:numFmt w:val="decimal"/>
-      <w:suff w:val="tab"/>
       <w:lvlText w:val="%1)"/>
       <w:lvlJc w:val="left"/>
       <w:pPr>
@@ -607,10 +775,9 @@
         <w:vertAlign w:val="baseline"/>
       </w:rPr>
     </w:lvl>
-    <w:lvl w:ilvl="1">
+    <w:lvl w:ilvl="1" w:tplc="60146B8A">
       <w:start w:val="1"/>
       <w:numFmt w:val="decimal"/>
-      <w:suff w:val="tab"/>
       <w:lvlText w:val="%2)"/>
       <w:lvlJc w:val="left"/>
       <w:pPr>
@@ -633,10 +800,9 @@
         <w:vertAlign w:val="baseline"/>
       </w:rPr>
     </w:lvl>
-    <w:lvl w:ilvl="2">
+    <w:lvl w:ilvl="2" w:tplc="03B454A0">
       <w:start w:val="1"/>
       <w:numFmt w:val="decimal"/>
-      <w:suff w:val="tab"/>
       <w:lvlText w:val="%3)"/>
       <w:lvlJc w:val="left"/>
       <w:pPr>
@@ -659,10 +825,9 @@
         <w:vertAlign w:val="baseline"/>
       </w:rPr>
     </w:lvl>
-    <w:lvl w:ilvl="3">
+    <w:lvl w:ilvl="3" w:tplc="EE4201C2">
       <w:start w:val="1"/>
       <w:numFmt w:val="decimal"/>
-      <w:suff w:val="tab"/>
       <w:lvlText w:val="%4)"/>
       <w:lvlJc w:val="left"/>
       <w:pPr>
@@ -685,10 +850,9 @@
         <w:vertAlign w:val="baseline"/>
       </w:rPr>
     </w:lvl>
-    <w:lvl w:ilvl="4">
+    <w:lvl w:ilvl="4" w:tplc="D1DA43FA">
       <w:start w:val="1"/>
       <w:numFmt w:val="decimal"/>
-      <w:suff w:val="tab"/>
       <w:lvlText w:val="%5)"/>
       <w:lvlJc w:val="left"/>
       <w:pPr>
@@ -711,10 +875,9 @@
         <w:vertAlign w:val="baseline"/>
       </w:rPr>
     </w:lvl>
-    <w:lvl w:ilvl="5">
+    <w:lvl w:ilvl="5" w:tplc="3D78734A">
       <w:start w:val="1"/>
       <w:numFmt w:val="decimal"/>
-      <w:suff w:val="tab"/>
       <w:lvlText w:val="%6)"/>
       <w:lvlJc w:val="left"/>
       <w:pPr>
@@ -737,10 +900,9 @@
         <w:vertAlign w:val="baseline"/>
       </w:rPr>
     </w:lvl>
-    <w:lvl w:ilvl="6">
+    <w:lvl w:ilvl="6" w:tplc="60EE1C84">
       <w:start w:val="1"/>
       <w:numFmt w:val="decimal"/>
-      <w:suff w:val="tab"/>
       <w:lvlText w:val="%7)"/>
       <w:lvlJc w:val="left"/>
       <w:pPr>
@@ -763,10 +925,9 @@
         <w:vertAlign w:val="baseline"/>
       </w:rPr>
     </w:lvl>
-    <w:lvl w:ilvl="7">
+    <w:lvl w:ilvl="7" w:tplc="576C56D2">
       <w:start w:val="1"/>
       <w:numFmt w:val="decimal"/>
-      <w:suff w:val="tab"/>
       <w:lvlText w:val="%8)"/>
       <w:lvlJc w:val="left"/>
       <w:pPr>
@@ -789,10 +950,9 @@
         <w:vertAlign w:val="baseline"/>
       </w:rPr>
     </w:lvl>
-    <w:lvl w:ilvl="8">
+    <w:lvl w:ilvl="8" w:tplc="34503BBC">
       <w:start w:val="1"/>
       <w:numFmt w:val="decimal"/>
-      <w:suff w:val="tab"/>
       <w:lvlText w:val="%9)"/>
       <w:lvlJc w:val="left"/>
       <w:pPr>
@@ -816,55 +976,24 @@
       </w:rPr>
     </w:lvl>
   </w:abstractNum>
-  <w:num w:numId="1">
+  <w:num w:numId="1" w16cid:durableId="494684453">
     <w:abstractNumId w:val="0"/>
   </w:num>
 </w:numbering>
 </file>
 
 <file path=word/styles.xml><?xml version="1.0" encoding="utf-8"?>
-<w:styles xmlns:w="http://schemas.openxmlformats.org/wordprocessingml/2006/main" xmlns:mc="http://schemas.openxmlformats.org/markup-compatibility/2006" xmlns:w14="http://schemas.microsoft.com/office/word/2010/wordml" mc:Ignorable="w14">
+<w:styles xmlns:mc="http://schemas.openxmlformats.org/markup-compatibility/2006" xmlns:r="http://schemas.openxmlformats.org/officeDocument/2006/relationships" xmlns:w="http://schemas.openxmlformats.org/wordprocessingml/2006/main" xmlns:w14="http://schemas.microsoft.com/office/word/2010/wordml" xmlns:w15="http://schemas.microsoft.com/office/word/2012/wordml" xmlns:w16cex="http://schemas.microsoft.com/office/word/2018/wordml/cex" xmlns:w16cid="http://schemas.microsoft.com/office/word/2016/wordml/cid" xmlns:w16="http://schemas.microsoft.com/office/word/2018/wordml" xmlns:w16du="http://schemas.microsoft.com/office/word/2023/wordml/word16du" xmlns:w16sdtdh="http://schemas.microsoft.com/office/word/2020/wordml/sdtdatahash" xmlns:w16sdtfl="http://schemas.microsoft.com/office/word/2024/wordml/sdtformatlock" xmlns:w16se="http://schemas.microsoft.com/office/word/2015/wordml/symex" mc:Ignorable="w14 w15 w16se w16cid w16 w16cex w16sdtdh w16sdtfl w16du">
   <w:docDefaults>
     <w:rPrDefault>
       <w:rPr>
-        <w:rFonts w:ascii="Times New Roman" w:cs="Times New Roman" w:hAnsi="Times New Roman" w:eastAsia="Arial Unicode MS"/>
-        <w:b w:val="0"/>
-        <w:bCs w:val="0"/>
-        <w:i w:val="0"/>
-        <w:iCs w:val="0"/>
-        <w:caps w:val="0"/>
-        <w:smallCaps w:val="0"/>
-        <w:strike w:val="0"/>
-        <w:dstrike w:val="0"/>
-        <w:outline w:val="0"/>
-        <w:emboss w:val="0"/>
-        <w:imprint w:val="0"/>
-        <w:vanish w:val="0"/>
-        <w:color w:val="auto"/>
-        <w:spacing w:val="0"/>
-        <w:w w:val="100"/>
-        <w:kern w:val="0"/>
-        <w:position w:val="0"/>
-        <w:sz w:val="20"/>
-        <w:szCs w:val="20"/>
-        <w:u w:val="none" w:color="auto"/>
+        <w:rFonts w:ascii="Times New Roman" w:eastAsia="Arial Unicode MS" w:hAnsi="Times New Roman" w:cs="Times New Roman"/>
         <w:bdr w:val="nil"/>
-        <w:vertAlign w:val="baseline"/>
-        <w:lang/>
+        <w:lang w:val="en-US" w:eastAsia="en-US" w:bidi="ar-SA"/>
       </w:rPr>
     </w:rPrDefault>
     <w:pPrDefault>
       <w:pPr>
-        <w:keepNext w:val="0"/>
-        <w:keepLines w:val="0"/>
-        <w:pageBreakBefore w:val="0"/>
-        <w:framePr w:anchorLock="0" w:w="0" w:h="0" w:vSpace="0" w:hSpace="0" w:xAlign="left" w:y="0" w:hRule="exact" w:vAnchor="margin"/>
-        <w:widowControl w:val="1"/>
-        <w:numPr>
-          <w:ilvl w:val="0"/>
-          <w:numId w:val="0"/>
-        </w:numPr>
-        <w:suppressLineNumbers w:val="0"/>
         <w:pBdr>
           <w:top w:val="nil"/>
           <w:left w:val="nil"/>
@@ -873,28 +1002,421 @@
           <w:between w:val="nil"/>
           <w:bar w:val="nil"/>
         </w:pBdr>
-        <w:shd w:val="clear" w:color="auto" w:fill="auto"/>
-        <w:suppressAutoHyphens w:val="0"/>
-        <w:spacing w:before="0" w:beforeAutospacing="0" w:after="0" w:afterAutospacing="0" w:line="240" w:lineRule="auto"/>
-        <w:ind w:left="0" w:right="0" w:firstLine="0"/>
-        <w:jc w:val="left"/>
-        <w:outlineLvl w:val="9"/>
       </w:pPr>
     </w:pPrDefault>
   </w:docDefaults>
+  <w:latentStyles w:defLockedState="0" w:defUIPriority="99" w:defSemiHidden="0" w:defUnhideWhenUsed="0" w:defQFormat="0" w:count="376">
+    <w:lsdException w:name="Normal" w:uiPriority="0" w:qFormat="1"/>
+    <w:lsdException w:name="heading 1" w:uiPriority="9" w:qFormat="1"/>
+    <w:lsdException w:name="heading 2" w:semiHidden="1" w:uiPriority="9" w:unhideWhenUsed="1" w:qFormat="1"/>
+    <w:lsdException w:name="heading 3" w:semiHidden="1" w:uiPriority="9" w:unhideWhenUsed="1" w:qFormat="1"/>
+    <w:lsdException w:name="heading 4" w:semiHidden="1" w:uiPriority="9" w:unhideWhenUsed="1" w:qFormat="1"/>
+    <w:lsdException w:name="heading 5" w:semiHidden="1" w:uiPriority="9" w:unhideWhenUsed="1" w:qFormat="1"/>
+    <w:lsdException w:name="heading 6" w:semiHidden="1" w:uiPriority="9" w:unhideWhenUsed="1" w:qFormat="1"/>
+    <w:lsdException w:name="heading 7" w:semiHidden="1" w:uiPriority="9" w:unhideWhenUsed="1" w:qFormat="1"/>
+    <w:lsdException w:name="heading 8" w:semiHidden="1" w:uiPriority="9" w:unhideWhenUsed="1" w:qFormat="1"/>
+    <w:lsdException w:name="heading 9" w:semiHidden="1" w:uiPriority="9" w:unhideWhenUsed="1" w:qFormat="1"/>
+    <w:lsdException w:name="index 1" w:semiHidden="1" w:unhideWhenUsed="1"/>
+    <w:lsdException w:name="index 2" w:semiHidden="1" w:unhideWhenUsed="1"/>
+    <w:lsdException w:name="index 3" w:semiHidden="1" w:unhideWhenUsed="1"/>
+    <w:lsdException w:name="index 4" w:semiHidden="1" w:unhideWhenUsed="1"/>
+    <w:lsdException w:name="index 5" w:semiHidden="1" w:unhideWhenUsed="1"/>
+    <w:lsdException w:name="index 6" w:semiHidden="1" w:unhideWhenUsed="1"/>
+    <w:lsdException w:name="index 7" w:semiHidden="1" w:unhideWhenUsed="1"/>
+    <w:lsdException w:name="index 8" w:semiHidden="1" w:unhideWhenUsed="1"/>
+    <w:lsdException w:name="index 9" w:semiHidden="1" w:unhideWhenUsed="1"/>
+    <w:lsdException w:name="toc 1" w:semiHidden="1" w:uiPriority="39" w:unhideWhenUsed="1"/>
+    <w:lsdException w:name="toc 2" w:semiHidden="1" w:uiPriority="39" w:unhideWhenUsed="1"/>
+    <w:lsdException w:name="toc 3" w:semiHidden="1" w:uiPriority="39" w:unhideWhenUsed="1"/>
+    <w:lsdException w:name="toc 4" w:semiHidden="1" w:uiPriority="39" w:unhideWhenUsed="1"/>
+    <w:lsdException w:name="toc 5" w:semiHidden="1" w:uiPriority="39" w:unhideWhenUsed="1"/>
+    <w:lsdException w:name="toc 6" w:semiHidden="1" w:uiPriority="39" w:unhideWhenUsed="1"/>
+    <w:lsdException w:name="toc 7" w:semiHidden="1" w:uiPriority="39" w:unhideWhenUsed="1"/>
+    <w:lsdException w:name="toc 8" w:semiHidden="1" w:uiPriority="39" w:unhideWhenUsed="1"/>
+    <w:lsdException w:name="toc 9" w:semiHidden="1" w:uiPriority="39" w:unhideWhenUsed="1"/>
+    <w:lsdException w:name="Normal Indent" w:semiHidden="1" w:unhideWhenUsed="1"/>
+    <w:lsdException w:name="footnote text" w:semiHidden="1" w:unhideWhenUsed="1"/>
+    <w:lsdException w:name="annotation text" w:semiHidden="1" w:unhideWhenUsed="1"/>
+    <w:lsdException w:name="header" w:semiHidden="1" w:unhideWhenUsed="1"/>
+    <w:lsdException w:name="footer" w:semiHidden="1" w:unhideWhenUsed="1"/>
+    <w:lsdException w:name="index heading" w:semiHidden="1" w:unhideWhenUsed="1"/>
+    <w:lsdException w:name="caption" w:semiHidden="1" w:uiPriority="35" w:unhideWhenUsed="1" w:qFormat="1"/>
+    <w:lsdException w:name="table of figures" w:semiHidden="1" w:unhideWhenUsed="1"/>
+    <w:lsdException w:name="envelope address" w:semiHidden="1" w:unhideWhenUsed="1"/>
+    <w:lsdException w:name="envelope return" w:semiHidden="1" w:unhideWhenUsed="1"/>
+    <w:lsdException w:name="footnote reference" w:semiHidden="1" w:unhideWhenUsed="1"/>
+    <w:lsdException w:name="annotation reference" w:semiHidden="1" w:unhideWhenUsed="1"/>
+    <w:lsdException w:name="line number" w:semiHidden="1" w:unhideWhenUsed="1"/>
+    <w:lsdException w:name="page number" w:semiHidden="1" w:unhideWhenUsed="1"/>
+    <w:lsdException w:name="endnote reference" w:semiHidden="1" w:unhideWhenUsed="1"/>
+    <w:lsdException w:name="endnote text" w:semiHidden="1" w:unhideWhenUsed="1"/>
+    <w:lsdException w:name="table of authorities" w:semiHidden="1" w:unhideWhenUsed="1"/>
+    <w:lsdException w:name="macro" w:semiHidden="1" w:unhideWhenUsed="1"/>
+    <w:lsdException w:name="toa heading" w:semiHidden="1" w:unhideWhenUsed="1"/>
+    <w:lsdException w:name="List" w:semiHidden="1" w:unhideWhenUsed="1"/>
+    <w:lsdException w:name="List Bullet" w:semiHidden="1" w:unhideWhenUsed="1"/>
+    <w:lsdException w:name="List Number" w:semiHidden="1" w:unhideWhenUsed="1"/>
+    <w:lsdException w:name="List 2" w:semiHidden="1" w:unhideWhenUsed="1"/>
+    <w:lsdException w:name="List 3" w:semiHidden="1" w:unhideWhenUsed="1"/>
+    <w:lsdException w:name="List 4" w:semiHidden="1" w:unhideWhenUsed="1"/>
+    <w:lsdException w:name="List 5" w:semiHidden="1" w:unhideWhenUsed="1"/>
+    <w:lsdException w:name="List Bullet 2" w:semiHidden="1" w:unhideWhenUsed="1"/>
+    <w:lsdException w:name="List Bullet 3" w:semiHidden="1" w:unhideWhenUsed="1"/>
+    <w:lsdException w:name="List Bullet 4" w:semiHidden="1" w:unhideWhenUsed="1"/>
+    <w:lsdException w:name="List Bullet 5" w:semiHidden="1" w:unhideWhenUsed="1"/>
+    <w:lsdException w:name="List Number 2" w:semiHidden="1" w:unhideWhenUsed="1"/>
+    <w:lsdException w:name="List Number 3" w:semiHidden="1" w:unhideWhenUsed="1"/>
+    <w:lsdException w:name="List Number 4" w:semiHidden="1" w:unhideWhenUsed="1"/>
+    <w:lsdException w:name="List Number 5" w:semiHidden="1" w:unhideWhenUsed="1"/>
+    <w:lsdException w:name="Title" w:uiPriority="10" w:qFormat="1"/>
+    <w:lsdException w:name="Closing" w:semiHidden="1" w:unhideWhenUsed="1"/>
+    <w:lsdException w:name="Signature" w:semiHidden="1" w:unhideWhenUsed="1"/>
+    <w:lsdException w:name="Default Paragraph Font" w:semiHidden="1" w:uiPriority="1" w:unhideWhenUsed="1"/>
+    <w:lsdException w:name="Body Text" w:semiHidden="1" w:unhideWhenUsed="1"/>
+    <w:lsdException w:name="Body Text Indent" w:semiHidden="1" w:unhideWhenUsed="1"/>
+    <w:lsdException w:name="List Continue" w:semiHidden="1" w:unhideWhenUsed="1"/>
+    <w:lsdException w:name="List Continue 2" w:semiHidden="1" w:unhideWhenUsed="1"/>
+    <w:lsdException w:name="List Continue 3" w:semiHidden="1" w:unhideWhenUsed="1"/>
+    <w:lsdException w:name="List Continue 4" w:semiHidden="1" w:unhideWhenUsed="1"/>
+    <w:lsdException w:name="List Continue 5" w:semiHidden="1" w:unhideWhenUsed="1"/>
+    <w:lsdException w:name="Message Header" w:semiHidden="1" w:unhideWhenUsed="1"/>
+    <w:lsdException w:name="Subtitle" w:uiPriority="11" w:qFormat="1"/>
+    <w:lsdException w:name="Salutation" w:semiHidden="1" w:unhideWhenUsed="1"/>
+    <w:lsdException w:name="Date" w:semiHidden="1" w:unhideWhenUsed="1"/>
+    <w:lsdException w:name="Body Text First Indent" w:semiHidden="1" w:unhideWhenUsed="1"/>
+    <w:lsdException w:name="Body Text First Indent 2" w:semiHidden="1" w:unhideWhenUsed="1"/>
+    <w:lsdException w:name="Note Heading" w:semiHidden="1" w:unhideWhenUsed="1"/>
+    <w:lsdException w:name="Body Text 2" w:semiHidden="1" w:unhideWhenUsed="1"/>
+    <w:lsdException w:name="Body Text 3" w:semiHidden="1" w:unhideWhenUsed="1"/>
+    <w:lsdException w:name="Body Text Indent 2" w:semiHidden="1" w:unhideWhenUsed="1"/>
+    <w:lsdException w:name="Body Text Indent 3" w:semiHidden="1" w:unhideWhenUsed="1"/>
+    <w:lsdException w:name="Block Text" w:semiHidden="1" w:unhideWhenUsed="1"/>
+    <w:lsdException w:name="Hyperlink" w:semiHidden="1" w:unhideWhenUsed="1"/>
+    <w:lsdException w:name="FollowedHyperlink" w:semiHidden="1" w:unhideWhenUsed="1"/>
+    <w:lsdException w:name="Strong" w:uiPriority="22" w:qFormat="1"/>
+    <w:lsdException w:name="Emphasis" w:uiPriority="20" w:qFormat="1"/>
+    <w:lsdException w:name="Document Map" w:semiHidden="1" w:unhideWhenUsed="1"/>
+    <w:lsdException w:name="Plain Text" w:semiHidden="1" w:unhideWhenUsed="1"/>
+    <w:lsdException w:name="E-mail Signature" w:semiHidden="1" w:unhideWhenUsed="1"/>
+    <w:lsdException w:name="HTML Top of Form" w:semiHidden="1" w:unhideWhenUsed="1"/>
+    <w:lsdException w:name="HTML Bottom of Form" w:semiHidden="1" w:unhideWhenUsed="1"/>
+    <w:lsdException w:name="Normal (Web)" w:semiHidden="1" w:unhideWhenUsed="1"/>
+    <w:lsdException w:name="HTML Acronym" w:semiHidden="1" w:unhideWhenUsed="1"/>
+    <w:lsdException w:name="HTML Address" w:semiHidden="1" w:unhideWhenUsed="1"/>
+    <w:lsdException w:name="HTML Cite" w:semiHidden="1" w:unhideWhenUsed="1"/>
+    <w:lsdException w:name="HTML Code" w:semiHidden="1" w:unhideWhenUsed="1"/>
+    <w:lsdException w:name="HTML Definition" w:semiHidden="1" w:unhideWhenUsed="1"/>
+    <w:lsdException w:name="HTML Keyboard" w:semiHidden="1" w:unhideWhenUsed="1"/>
+    <w:lsdException w:name="HTML Preformatted" w:semiHidden="1" w:unhideWhenUsed="1"/>
+    <w:lsdException w:name="HTML Sample" w:semiHidden="1" w:unhideWhenUsed="1"/>
+    <w:lsdException w:name="HTML Typewriter" w:semiHidden="1" w:unhideWhenUsed="1"/>
+    <w:lsdException w:name="HTML Variable" w:semiHidden="1" w:unhideWhenUsed="1"/>
+    <w:lsdException w:name="Normal Table" w:semiHidden="1" w:unhideWhenUsed="1"/>
+    <w:lsdException w:name="annotation subject" w:semiHidden="1" w:unhideWhenUsed="1"/>
+    <w:lsdException w:name="No List" w:semiHidden="1" w:unhideWhenUsed="1"/>
+    <w:lsdException w:name="Outline List 1" w:semiHidden="1" w:unhideWhenUsed="1"/>
+    <w:lsdException w:name="Outline List 2" w:semiHidden="1" w:unhideWhenUsed="1"/>
+    <w:lsdException w:name="Outline List 3" w:semiHidden="1" w:unhideWhenUsed="1"/>
+    <w:lsdException w:name="Table Simple 1" w:semiHidden="1" w:unhideWhenUsed="1"/>
+    <w:lsdException w:name="Table Simple 2" w:semiHidden="1" w:unhideWhenUsed="1"/>
+    <w:lsdException w:name="Table Simple 3" w:semiHidden="1" w:unhideWhenUsed="1"/>
+    <w:lsdException w:name="Table Classic 1" w:semiHidden="1" w:unhideWhenUsed="1"/>
+    <w:lsdException w:name="Table Classic 2" w:semiHidden="1" w:unhideWhenUsed="1"/>
+    <w:lsdException w:name="Table Classic 3" w:semiHidden="1" w:unhideWhenUsed="1"/>
+    <w:lsdException w:name="Table Classic 4" w:semiHidden="1" w:unhideWhenUsed="1"/>
+    <w:lsdException w:name="Table Colorful 1" w:semiHidden="1" w:unhideWhenUsed="1"/>
+    <w:lsdException w:name="Table Colorful 2" w:semiHidden="1" w:unhideWhenUsed="1"/>
+    <w:lsdException w:name="Table Colorful 3" w:semiHidden="1" w:unhideWhenUsed="1"/>
+    <w:lsdException w:name="Table Columns 1" w:semiHidden="1" w:unhideWhenUsed="1"/>
+    <w:lsdException w:name="Table Columns 2" w:semiHidden="1" w:unhideWhenUsed="1"/>
+    <w:lsdException w:name="Table Columns 3" w:semiHidden="1" w:unhideWhenUsed="1"/>
+    <w:lsdException w:name="Table Columns 4" w:semiHidden="1" w:unhideWhenUsed="1"/>
+    <w:lsdException w:name="Table Columns 5" w:semiHidden="1" w:unhideWhenUsed="1"/>
+    <w:lsdException w:name="Table Grid 1" w:semiHidden="1" w:unhideWhenUsed="1"/>
+    <w:lsdException w:name="Table Grid 2" w:semiHidden="1" w:unhideWhenUsed="1"/>
+    <w:lsdException w:name="Table Grid 3" w:semiHidden="1" w:unhideWhenUsed="1"/>
+    <w:lsdException w:name="Table Grid 4" w:semiHidden="1" w:unhideWhenUsed="1"/>
+    <w:lsdException w:name="Table Grid 5" w:semiHidden="1" w:unhideWhenUsed="1"/>
+    <w:lsdException w:name="Table Grid 6" w:semiHidden="1" w:unhideWhenUsed="1"/>
+    <w:lsdException w:name="Table Grid 7" w:semiHidden="1" w:unhideWhenUsed="1"/>
+    <w:lsdException w:name="Table Grid 8" w:semiHidden="1" w:unhideWhenUsed="1"/>
+    <w:lsdException w:name="Table List 1" w:semiHidden="1" w:unhideWhenUsed="1"/>
+    <w:lsdException w:name="Table List 2" w:semiHidden="1" w:unhideWhenUsed="1"/>
+    <w:lsdException w:name="Table List 3" w:semiHidden="1" w:unhideWhenUsed="1"/>
+    <w:lsdException w:name="Table List 4" w:semiHidden="1" w:unhideWhenUsed="1"/>
+    <w:lsdException w:name="Table List 5" w:semiHidden="1" w:unhideWhenUsed="1"/>
+    <w:lsdException w:name="Table List 6" w:semiHidden="1" w:unhideWhenUsed="1"/>
+    <w:lsdException w:name="Table List 7" w:semiHidden="1" w:unhideWhenUsed="1"/>
+    <w:lsdException w:name="Table List 8" w:semiHidden="1" w:unhideWhenUsed="1"/>
+    <w:lsdException w:name="Table 3D effects 1" w:semiHidden="1" w:unhideWhenUsed="1"/>
+    <w:lsdException w:name="Table 3D effects 2" w:semiHidden="1" w:unhideWhenUsed="1"/>
+    <w:lsdException w:name="Table 3D effects 3" w:semiHidden="1" w:unhideWhenUsed="1"/>
+    <w:lsdException w:name="Table Contemporary" w:semiHidden="1" w:unhideWhenUsed="1"/>
+    <w:lsdException w:name="Table Elegant" w:semiHidden="1" w:unhideWhenUsed="1"/>
+    <w:lsdException w:name="Table Professional" w:semiHidden="1" w:unhideWhenUsed="1"/>
+    <w:lsdException w:name="Table Subtle 1" w:semiHidden="1" w:unhideWhenUsed="1"/>
+    <w:lsdException w:name="Table Subtle 2" w:semiHidden="1" w:unhideWhenUsed="1"/>
+    <w:lsdException w:name="Table Web 1" w:semiHidden="1" w:unhideWhenUsed="1"/>
+    <w:lsdException w:name="Table Web 2" w:semiHidden="1" w:unhideWhenUsed="1"/>
+    <w:lsdException w:name="Table Web 3" w:semiHidden="1" w:unhideWhenUsed="1"/>
+    <w:lsdException w:name="Balloon Text" w:semiHidden="1" w:unhideWhenUsed="1"/>
+    <w:lsdException w:name="Table Grid" w:uiPriority="39"/>
+    <w:lsdException w:name="Table Theme" w:semiHidden="1" w:unhideWhenUsed="1"/>
+    <w:lsdException w:name="Placeholder Text" w:semiHidden="1"/>
+    <w:lsdException w:name="No Spacing" w:uiPriority="1" w:qFormat="1"/>
+    <w:lsdException w:name="Light Shading" w:uiPriority="60"/>
+    <w:lsdException w:name="Light List" w:uiPriority="61"/>
+    <w:lsdException w:name="Light Grid" w:uiPriority="62"/>
+    <w:lsdException w:name="Medium Shading 1" w:uiPriority="63"/>
+    <w:lsdException w:name="Medium Shading 2" w:uiPriority="64"/>
+    <w:lsdException w:name="Medium List 1" w:uiPriority="65"/>
+    <w:lsdException w:name="Medium List 2" w:uiPriority="66"/>
+    <w:lsdException w:name="Medium Grid 1" w:uiPriority="67"/>
+    <w:lsdException w:name="Medium Grid 2" w:uiPriority="68"/>
+    <w:lsdException w:name="Medium Grid 3" w:uiPriority="69"/>
+    <w:lsdException w:name="Dark List" w:uiPriority="70"/>
+    <w:lsdException w:name="Colorful Shading" w:uiPriority="71"/>
+    <w:lsdException w:name="Colorful List" w:uiPriority="72"/>
+    <w:lsdException w:name="Colorful Grid" w:uiPriority="73"/>
+    <w:lsdException w:name="Light Shading Accent 1" w:uiPriority="60"/>
+    <w:lsdException w:name="Light List Accent 1" w:uiPriority="61"/>
+    <w:lsdException w:name="Light Grid Accent 1" w:uiPriority="62"/>
+    <w:lsdException w:name="Medium Shading 1 Accent 1" w:uiPriority="63"/>
+    <w:lsdException w:name="Medium Shading 2 Accent 1" w:uiPriority="64"/>
+    <w:lsdException w:name="Medium List 1 Accent 1" w:uiPriority="65"/>
+    <w:lsdException w:name="Revision" w:semiHidden="1"/>
+    <w:lsdException w:name="List Paragraph" w:uiPriority="34" w:qFormat="1"/>
+    <w:lsdException w:name="Quote" w:uiPriority="29" w:qFormat="1"/>
+    <w:lsdException w:name="Intense Quote" w:uiPriority="30" w:qFormat="1"/>
+    <w:lsdException w:name="Medium List 2 Accent 1" w:uiPriority="66"/>
+    <w:lsdException w:name="Medium Grid 1 Accent 1" w:uiPriority="67"/>
+    <w:lsdException w:name="Medium Grid 2 Accent 1" w:uiPriority="68"/>
+    <w:lsdException w:name="Medium Grid 3 Accent 1" w:uiPriority="69"/>
+    <w:lsdException w:name="Dark List Accent 1" w:uiPriority="70"/>
+    <w:lsdException w:name="Colorful Shading Accent 1" w:uiPriority="71"/>
+    <w:lsdException w:name="Colorful List Accent 1" w:uiPriority="72"/>
+    <w:lsdException w:name="Colorful Grid Accent 1" w:uiPriority="73"/>
+    <w:lsdException w:name="Light Shading Accent 2" w:uiPriority="60"/>
+    <w:lsdException w:name="Light List Accent 2" w:uiPriority="61"/>
+    <w:lsdException w:name="Light Grid Accent 2" w:uiPriority="62"/>
+    <w:lsdException w:name="Medium Shading 1 Accent 2" w:uiPriority="63"/>
+    <w:lsdException w:name="Medium Shading 2 Accent 2" w:uiPriority="64"/>
+    <w:lsdException w:name="Medium List 1 Accent 2" w:uiPriority="65"/>
+    <w:lsdException w:name="Medium List 2 Accent 2" w:uiPriority="66"/>
+    <w:lsdException w:name="Medium Grid 1 Accent 2" w:uiPriority="67"/>
+    <w:lsdException w:name="Medium Grid 2 Accent 2" w:uiPriority="68"/>
+    <w:lsdException w:name="Medium Grid 3 Accent 2" w:uiPriority="69"/>
+    <w:lsdException w:name="Dark List Accent 2" w:uiPriority="70"/>
+    <w:lsdException w:name="Colorful Shading Accent 2" w:uiPriority="71"/>
+    <w:lsdException w:name="Colorful List Accent 2" w:uiPriority="72"/>
+    <w:lsdException w:name="Colorful Grid Accent 2" w:uiPriority="73"/>
+    <w:lsdException w:name="Light Shading Accent 3" w:uiPriority="60"/>
+    <w:lsdException w:name="Light List Accent 3" w:uiPriority="61"/>
+    <w:lsdException w:name="Light Grid Accent 3" w:uiPriority="62"/>
+    <w:lsdException w:name="Medium Shading 1 Accent 3" w:uiPriority="63"/>
+    <w:lsdException w:name="Medium Shading 2 Accent 3" w:uiPriority="64"/>
+    <w:lsdException w:name="Medium List 1 Accent 3" w:uiPriority="65"/>
+    <w:lsdException w:name="Medium List 2 Accent 3" w:uiPriority="66"/>
+    <w:lsdException w:name="Medium Grid 1 Accent 3" w:uiPriority="67"/>
+    <w:lsdException w:name="Medium Grid 2 Accent 3" w:uiPriority="68"/>
+    <w:lsdException w:name="Medium Grid 3 Accent 3" w:uiPriority="69"/>
+    <w:lsdException w:name="Dark List Accent 3" w:uiPriority="70"/>
+    <w:lsdException w:name="Colorful Shading Accent 3" w:uiPriority="71"/>
+    <w:lsdException w:name="Colorful List Accent 3" w:uiPriority="72"/>
+    <w:lsdException w:name="Colorful Grid Accent 3" w:uiPriority="73"/>
+    <w:lsdException w:name="Light Shading Accent 4" w:uiPriority="60"/>
+    <w:lsdException w:name="Light List Accent 4" w:uiPriority="61"/>
+    <w:lsdException w:name="Light Grid Accent 4" w:uiPriority="62"/>
+    <w:lsdException w:name="Medium Shading 1 Accent 4" w:uiPriority="63"/>
+    <w:lsdException w:name="Medium Shading 2 Accent 4" w:uiPriority="64"/>
+    <w:lsdException w:name="Medium List 1 Accent 4" w:uiPriority="65"/>
+    <w:lsdException w:name="Medium List 2 Accent 4" w:uiPriority="66"/>
+    <w:lsdException w:name="Medium Grid 1 Accent 4" w:uiPriority="67"/>
+    <w:lsdException w:name="Medium Grid 2 Accent 4" w:uiPriority="68"/>
+    <w:lsdException w:name="Medium Grid 3 Accent 4" w:uiPriority="69"/>
+    <w:lsdException w:name="Dark List Accent 4" w:uiPriority="70"/>
+    <w:lsdException w:name="Colorful Shading Accent 4" w:uiPriority="71"/>
+    <w:lsdException w:name="Colorful List Accent 4" w:uiPriority="72"/>
+    <w:lsdException w:name="Colorful Grid Accent 4" w:uiPriority="73"/>
+    <w:lsdException w:name="Light Shading Accent 5" w:uiPriority="60"/>
+    <w:lsdException w:name="Light List Accent 5" w:uiPriority="61"/>
+    <w:lsdException w:name="Light Grid Accent 5" w:uiPriority="62"/>
+    <w:lsdException w:name="Medium Shading 1 Accent 5" w:uiPriority="63"/>
+    <w:lsdException w:name="Medium Shading 2 Accent 5" w:uiPriority="64"/>
+    <w:lsdException w:name="Medium List 1 Accent 5" w:uiPriority="65"/>
+    <w:lsdException w:name="Medium List 2 Accent 5" w:uiPriority="66"/>
+    <w:lsdException w:name="Medium Grid 1 Accent 5" w:uiPriority="67"/>
+    <w:lsdException w:name="Medium Grid 2 Accent 5" w:uiPriority="68"/>
+    <w:lsdException w:name="Medium Grid 3 Accent 5" w:uiPriority="69"/>
+    <w:lsdException w:name="Dark List Accent 5" w:uiPriority="70"/>
+    <w:lsdException w:name="Colorful Shading Accent 5" w:uiPriority="71"/>
+    <w:lsdException w:name="Colorful List Accent 5" w:uiPriority="72"/>
+    <w:lsdException w:name="Colorful Grid Accent 5" w:uiPriority="73"/>
+    <w:lsdException w:name="Light Shading Accent 6" w:uiPriority="60"/>
+    <w:lsdException w:name="Light List Accent 6" w:uiPriority="61"/>
+    <w:lsdException w:name="Light Grid Accent 6" w:uiPriority="62"/>
+    <w:lsdException w:name="Medium Shading 1 Accent 6" w:uiPriority="63"/>
+    <w:lsdException w:name="Medium Shading 2 Accent 6" w:uiPriority="64"/>
+    <w:lsdException w:name="Medium List 1 Accent 6" w:uiPriority="65"/>
+    <w:lsdException w:name="Medium List 2 Accent 6" w:uiPriority="66"/>
+    <w:lsdException w:name="Medium Grid 1 Accent 6" w:uiPriority="67"/>
+    <w:lsdException w:name="Medium Grid 2 Accent 6" w:uiPriority="68"/>
+    <w:lsdException w:name="Medium Grid 3 Accent 6" w:uiPriority="69"/>
+    <w:lsdException w:name="Dark List Accent 6" w:uiPriority="70"/>
+    <w:lsdException w:name="Colorful Shading Accent 6" w:uiPriority="71"/>
+    <w:lsdException w:name="Colorful List Accent 6" w:uiPriority="72"/>
+    <w:lsdException w:name="Colorful Grid Accent 6" w:uiPriority="73"/>
+    <w:lsdException w:name="Subtle Emphasis" w:uiPriority="19" w:qFormat="1"/>
+    <w:lsdException w:name="Intense Emphasis" w:uiPriority="21" w:qFormat="1"/>
+    <w:lsdException w:name="Subtle Reference" w:uiPriority="31" w:qFormat="1"/>
+    <w:lsdException w:name="Intense Reference" w:uiPriority="32" w:qFormat="1"/>
+    <w:lsdException w:name="Book Title" w:uiPriority="33" w:qFormat="1"/>
+    <w:lsdException w:name="Bibliography" w:semiHidden="1" w:uiPriority="37" w:unhideWhenUsed="1"/>
+    <w:lsdException w:name="TOC Heading" w:semiHidden="1" w:uiPriority="39" w:unhideWhenUsed="1" w:qFormat="1"/>
+    <w:lsdException w:name="Plain Table 1" w:uiPriority="41"/>
+    <w:lsdException w:name="Plain Table 2" w:uiPriority="42"/>
+    <w:lsdException w:name="Plain Table 3" w:uiPriority="43"/>
+    <w:lsdException w:name="Plain Table 4" w:uiPriority="44"/>
+    <w:lsdException w:name="Plain Table 5" w:uiPriority="45"/>
+    <w:lsdException w:name="Grid Table Light" w:uiPriority="40"/>
+    <w:lsdException w:name="Grid Table 1 Light" w:uiPriority="46"/>
+    <w:lsdException w:name="Grid Table 2" w:uiPriority="47"/>
+    <w:lsdException w:name="Grid Table 3" w:uiPriority="48"/>
+    <w:lsdException w:name="Grid Table 4" w:uiPriority="49"/>
+    <w:lsdException w:name="Grid Table 5 Dark" w:uiPriority="50"/>
+    <w:lsdException w:name="Grid Table 6 Colorful" w:uiPriority="51"/>
+    <w:lsdException w:name="Grid Table 7 Colorful" w:uiPriority="52"/>
+    <w:lsdException w:name="Grid Table 1 Light Accent 1" w:uiPriority="46"/>
+    <w:lsdException w:name="Grid Table 2 Accent 1" w:uiPriority="47"/>
+    <w:lsdException w:name="Grid Table 3 Accent 1" w:uiPriority="48"/>
+    <w:lsdException w:name="Grid Table 4 Accent 1" w:uiPriority="49"/>
+    <w:lsdException w:name="Grid Table 5 Dark Accent 1" w:uiPriority="50"/>
+    <w:lsdException w:name="Grid Table 6 Colorful Accent 1" w:uiPriority="51"/>
+    <w:lsdException w:name="Grid Table 7 Colorful Accent 1" w:uiPriority="52"/>
+    <w:lsdException w:name="Grid Table 1 Light Accent 2" w:uiPriority="46"/>
+    <w:lsdException w:name="Grid Table 2 Accent 2" w:uiPriority="47"/>
+    <w:lsdException w:name="Grid Table 3 Accent 2" w:uiPriority="48"/>
+    <w:lsdException w:name="Grid Table 4 Accent 2" w:uiPriority="49"/>
+    <w:lsdException w:name="Grid Table 5 Dark Accent 2" w:uiPriority="50"/>
+    <w:lsdException w:name="Grid Table 6 Colorful Accent 2" w:uiPriority="51"/>
+    <w:lsdException w:name="Grid Table 7 Colorful Accent 2" w:uiPriority="52"/>
+    <w:lsdException w:name="Grid Table 1 Light Accent 3" w:uiPriority="46"/>
+    <w:lsdException w:name="Grid Table 2 Accent 3" w:uiPriority="47"/>
+    <w:lsdException w:name="Grid Table 3 Accent 3" w:uiPriority="48"/>
+    <w:lsdException w:name="Grid Table 4 Accent 3" w:uiPriority="49"/>
+    <w:lsdException w:name="Grid Table 5 Dark Accent 3" w:uiPriority="50"/>
+    <w:lsdException w:name="Grid Table 6 Colorful Accent 3" w:uiPriority="51"/>
+    <w:lsdException w:name="Grid Table 7 Colorful Accent 3" w:uiPriority="52"/>
+    <w:lsdException w:name="Grid Table 1 Light Accent 4" w:uiPriority="46"/>
+    <w:lsdException w:name="Grid Table 2 Accent 4" w:uiPriority="47"/>
+    <w:lsdException w:name="Grid Table 3 Accent 4" w:uiPriority="48"/>
+    <w:lsdException w:name="Grid Table 4 Accent 4" w:uiPriority="49"/>
+    <w:lsdException w:name="Grid Table 5 Dark Accent 4" w:uiPriority="50"/>
+    <w:lsdException w:name="Grid Table 6 Colorful Accent 4" w:uiPriority="51"/>
+    <w:lsdException w:name="Grid Table 7 Colorful Accent 4" w:uiPriority="52"/>
+    <w:lsdException w:name="Grid Table 1 Light Accent 5" w:uiPriority="46"/>
+    <w:lsdException w:name="Grid Table 2 Accent 5" w:uiPriority="47"/>
+    <w:lsdException w:name="Grid Table 3 Accent 5" w:uiPriority="48"/>
+    <w:lsdException w:name="Grid Table 4 Accent 5" w:uiPriority="49"/>
+    <w:lsdException w:name="Grid Table 5 Dark Accent 5" w:uiPriority="50"/>
+    <w:lsdException w:name="Grid Table 6 Colorful Accent 5" w:uiPriority="51"/>
+    <w:lsdException w:name="Grid Table 7 Colorful Accent 5" w:uiPriority="52"/>
+    <w:lsdException w:name="Grid Table 1 Light Accent 6" w:uiPriority="46"/>
+    <w:lsdException w:name="Grid Table 2 Accent 6" w:uiPriority="47"/>
+    <w:lsdException w:name="Grid Table 3 Accent 6" w:uiPriority="48"/>
+    <w:lsdException w:name="Grid Table 4 Accent 6" w:uiPriority="49"/>
+    <w:lsdException w:name="Grid Table 5 Dark Accent 6" w:uiPriority="50"/>
+    <w:lsdException w:name="Grid Table 6 Colorful Accent 6" w:uiPriority="51"/>
+    <w:lsdException w:name="Grid Table 7 Colorful Accent 6" w:uiPriority="52"/>
+    <w:lsdException w:name="List Table 1 Light" w:uiPriority="46"/>
+    <w:lsdException w:name="List Table 2" w:uiPriority="47"/>
+    <w:lsdException w:name="List Table 3" w:uiPriority="48"/>
+    <w:lsdException w:name="List Table 4" w:uiPriority="49"/>
+    <w:lsdException w:name="List Table 5 Dark" w:uiPriority="50"/>
+    <w:lsdException w:name="List Table 6 Colorful" w:uiPriority="51"/>
+    <w:lsdException w:name="List Table 7 Colorful" w:uiPriority="52"/>
+    <w:lsdException w:name="List Table 1 Light Accent 1" w:uiPriority="46"/>
+    <w:lsdException w:name="List Table 2 Accent 1" w:uiPriority="47"/>
+    <w:lsdException w:name="List Table 3 Accent 1" w:uiPriority="48"/>
+    <w:lsdException w:name="List Table 4 Accent 1" w:uiPriority="49"/>
+    <w:lsdException w:name="List Table 5 Dark Accent 1" w:uiPriority="50"/>
+    <w:lsdException w:name="List Table 6 Colorful Accent 1" w:uiPriority="51"/>
+    <w:lsdException w:name="List Table 7 Colorful Accent 1" w:uiPriority="52"/>
+    <w:lsdException w:name="List Table 1 Light Accent 2" w:uiPriority="46"/>
+    <w:lsdException w:name="List Table 2 Accent 2" w:uiPriority="47"/>
+    <w:lsdException w:name="List Table 3 Accent 2" w:uiPriority="48"/>
+    <w:lsdException w:name="List Table 4 Accent 2" w:uiPriority="49"/>
+    <w:lsdException w:name="List Table 5 Dark Accent 2" w:uiPriority="50"/>
+    <w:lsdException w:name="List Table 6 Colorful Accent 2" w:uiPriority="51"/>
+    <w:lsdException w:name="List Table 7 Colorful Accent 2" w:uiPriority="52"/>
+    <w:lsdException w:name="List Table 1 Light Accent 3" w:uiPriority="46"/>
+    <w:lsdException w:name="List Table 2 Accent 3" w:uiPriority="47"/>
+    <w:lsdException w:name="List Table 3 Accent 3" w:uiPriority="48"/>
+    <w:lsdException w:name="List Table 4 Accent 3" w:uiPriority="49"/>
+    <w:lsdException w:name="List Table 5 Dark Accent 3" w:uiPriority="50"/>
+    <w:lsdException w:name="List Table 6 Colorful Accent 3" w:uiPriority="51"/>
+    <w:lsdException w:name="List Table 7 Colorful Accent 3" w:uiPriority="52"/>
+    <w:lsdException w:name="List Table 1 Light Accent 4" w:uiPriority="46"/>
+    <w:lsdException w:name="List Table 2 Accent 4" w:uiPriority="47"/>
+    <w:lsdException w:name="List Table 3 Accent 4" w:uiPriority="48"/>
+    <w:lsdException w:name="List Table 4 Accent 4" w:uiPriority="49"/>
+    <w:lsdException w:name="List Table 5 Dark Accent 4" w:uiPriority="50"/>
+    <w:lsdException w:name="List Table 6 Colorful Accent 4" w:uiPriority="51"/>
+    <w:lsdException w:name="List Table 7 Colorful Accent 4" w:uiPriority="52"/>
+    <w:lsdException w:name="List Table 1 Light Accent 5" w:uiPriority="46"/>
+    <w:lsdException w:name="List Table 2 Accent 5" w:uiPriority="47"/>
+    <w:lsdException w:name="List Table 3 Accent 5" w:uiPriority="48"/>
+    <w:lsdException w:name="List Table 4 Accent 5" w:uiPriority="49"/>
+    <w:lsdException w:name="List Table 5 Dark Accent 5" w:uiPriority="50"/>
+    <w:lsdException w:name="List Table 6 Colorful Accent 5" w:uiPriority="51"/>
+    <w:lsdException w:name="List Table 7 Colorful Accent 5" w:uiPriority="52"/>
+    <w:lsdException w:name="List Table 1 Light Accent 6" w:uiPriority="46"/>
+    <w:lsdException w:name="List Table 2 Accent 6" w:uiPriority="47"/>
+    <w:lsdException w:name="List Table 3 Accent 6" w:uiPriority="48"/>
+    <w:lsdException w:name="List Table 4 Accent 6" w:uiPriority="49"/>
+    <w:lsdException w:name="List Table 5 Dark Accent 6" w:uiPriority="50"/>
+    <w:lsdException w:name="List Table 6 Colorful Accent 6" w:uiPriority="51"/>
+    <w:lsdException w:name="List Table 7 Colorful Accent 6" w:uiPriority="52"/>
+    <w:lsdException w:name="Mention" w:semiHidden="1" w:unhideWhenUsed="1"/>
+    <w:lsdException w:name="Smart Hyperlink" w:semiHidden="1" w:unhideWhenUsed="1"/>
+    <w:lsdException w:name="Hashtag" w:semiHidden="1" w:unhideWhenUsed="1"/>
+    <w:lsdException w:name="Unresolved Mention" w:semiHidden="1" w:unhideWhenUsed="1"/>
+    <w:lsdException w:name="Smart Link" w:semiHidden="1" w:unhideWhenUsed="1"/>
+  </w:latentStyles>
   <w:style w:type="paragraph" w:default="1" w:styleId="Normal">
     <w:name w:val="Normal"/>
-    <w:next w:val="Normal"/>
-    <w:pPr/>
+    <w:qFormat/>
     <w:rPr>
       <w:sz w:val="24"/>
       <w:szCs w:val="24"/>
-      <w:lang w:val="en-US" w:eastAsia="en-US" w:bidi="ar-SA"/>
     </w:rPr>
   </w:style>
-  <w:style w:type="character" w:default="1" w:styleId="Default Paragraph Font">
+  <w:style w:type="character" w:default="1" w:styleId="DefaultParagraphFont">
     <w:name w:val="Default Paragraph Font"/>
-    <w:next w:val="Default Paragraph Font"/>
+    <w:uiPriority w:val="1"/>
+    <w:semiHidden/>
+    <w:unhideWhenUsed/>
+  </w:style>
+  <w:style w:type="table" w:default="1" w:styleId="TableNormal">
+    <w:name w:val="Normal Table"/>
+    <w:uiPriority w:val="99"/>
+    <w:semiHidden/>
+    <w:unhideWhenUsed/>
+    <w:tblPr>
+      <w:tblInd w:w="0" w:type="dxa"/>
+      <w:tblCellMar>
+        <w:top w:w="0" w:type="dxa"/>
+        <w:left w:w="108" w:type="dxa"/>
+        <w:bottom w:w="0" w:type="dxa"/>
+        <w:right w:w="108" w:type="dxa"/>
+      </w:tblCellMar>
+    </w:tblPr>
+  </w:style>
+  <w:style w:type="numbering" w:default="1" w:styleId="NoList">
+    <w:name w:val="No List"/>
+    <w:uiPriority w:val="99"/>
+    <w:semiHidden/>
+    <w:unhideWhenUsed/>
   </w:style>
   <w:style w:type="character" w:styleId="Hyperlink">
     <w:name w:val="Hyperlink"/>
@@ -902,268 +1424,141 @@
       <w:u w:val="single"/>
     </w:rPr>
   </w:style>
-  <w:style w:type="table" w:default="1" w:styleId="Table Normal">
-    <w:name w:val="Table Normal"/>
-    <w:next w:val="Table Normal"/>
-    <w:pPr/>
-    <w:tblPr>
-      <w:tblInd w:w="0" w:type="dxa"/>
-    </w:tblPr>
-    <w:trPr/>
-    <w:tcPr/>
-    <w:tblStylePr w:type="firstRow"/>
-    <w:tblStylePr w:type="lastRow"/>
-    <w:tblStylePr w:type="firstCol"/>
-    <w:tblStylePr w:type="lastCol"/>
-    <w:tblStylePr w:type="band1Vert"/>
-    <w:tblStylePr w:type="band2Vert"/>
-    <w:tblStylePr w:type="band1Horz"/>
-    <w:tblStylePr w:type="band2Horz"/>
-    <w:tblStylePr w:type="neCell"/>
-    <w:tblStylePr w:type="nwCell"/>
-    <w:tblStylePr w:type="seCell"/>
-    <w:tblStylePr w:type="swCell"/>
-  </w:style>
-  <w:style w:type="numbering" w:default="1" w:styleId="No List">
-    <w:name w:val="No List"/>
-    <w:next w:val="No List"/>
-    <w:pPr/>
-  </w:style>
   <w:style w:type="paragraph" w:styleId="Title">
     <w:name w:val="Title"/>
     <w:next w:val="Body"/>
+    <w:uiPriority w:val="10"/>
+    <w:qFormat/>
     <w:pPr>
-      <w:keepNext w:val="1"/>
-      <w:keepLines w:val="0"/>
-      <w:pageBreakBefore w:val="0"/>
-      <w:widowControl w:val="1"/>
-      <w:shd w:val="clear" w:color="auto" w:fill="auto"/>
-      <w:suppressAutoHyphens w:val="0"/>
-      <w:bidi w:val="0"/>
-      <w:spacing w:before="0" w:after="0" w:line="240" w:lineRule="auto"/>
-      <w:ind w:left="0" w:right="0" w:firstLine="0"/>
-      <w:jc w:val="left"/>
-      <w:outlineLvl w:val="9"/>
+      <w:keepNext/>
     </w:pPr>
     <w:rPr>
-      <w:rFonts w:ascii="Arial Unicode MS" w:cs="Helvetica Neue" w:hAnsi="Arial Unicode MS" w:eastAsia="Arial Unicode MS" w:hint="cs"/>
-      <w:b w:val="1"/>
-      <w:bCs w:val="1"/>
-      <w:i w:val="0"/>
-      <w:iCs w:val="0"/>
-      <w:caps w:val="0"/>
-      <w:smallCaps w:val="0"/>
-      <w:strike w:val="0"/>
-      <w:dstrike w:val="0"/>
-      <w:outline w:val="0"/>
+      <w:rFonts w:ascii="Arial Unicode MS" w:hAnsi="Arial Unicode MS" w:cs="Helvetica Neue" w:hint="cs"/>
+      <w:b/>
+      <w:bCs/>
       <w:color w:val="000000"/>
-      <w:spacing w:val="0"/>
-      <w:kern w:val="0"/>
-      <w:position w:val="0"/>
       <w:sz w:val="60"/>
       <w:szCs w:val="60"/>
-      <w:u w:val="none"/>
-      <w:shd w:val="nil" w:color="auto" w:fill="auto"/>
-      <w:vertAlign w:val="baseline"/>
-      <w14:textOutline>
+      <w14:textOutline w14:w="0" w14:cap="flat" w14:cmpd="sng" w14:algn="ctr">
         <w14:noFill/>
+        <w14:prstDash w14:val="solid"/>
+        <w14:bevel/>
       </w14:textOutline>
-      <w14:textFill>
-        <w14:solidFill>
-          <w14:srgbClr w14:val="000000"/>
-        </w14:solidFill>
-      </w14:textFill>
     </w:rPr>
   </w:style>
-  <w:style w:type="paragraph" w:styleId="Body">
+  <w:style w:type="paragraph" w:customStyle="1" w:styleId="Body">
     <w:name w:val="Body"/>
-    <w:next w:val="Body"/>
+    <w:rPr>
+      <w:rFonts w:ascii="Arial Unicode MS" w:hAnsi="Arial Unicode MS" w:cs="Helvetica Neue" w:hint="cs"/>
+      <w:color w:val="000000"/>
+      <w:sz w:val="22"/>
+      <w:szCs w:val="22"/>
+      <w14:textOutline w14:w="0" w14:cap="flat" w14:cmpd="sng" w14:algn="ctr">
+        <w14:noFill/>
+        <w14:prstDash w14:val="solid"/>
+        <w14:bevel/>
+      </w14:textOutline>
+    </w:rPr>
+  </w:style>
+  <w:style w:type="paragraph" w:customStyle="1" w:styleId="TableStyle3">
+    <w:name w:val="Table Style 3"/>
     <w:pPr>
-      <w:keepNext w:val="0"/>
-      <w:keepLines w:val="0"/>
-      <w:pageBreakBefore w:val="0"/>
-      <w:widowControl w:val="1"/>
-      <w:shd w:val="clear" w:color="auto" w:fill="auto"/>
-      <w:suppressAutoHyphens w:val="0"/>
-      <w:bidi w:val="0"/>
-      <w:spacing w:before="0" w:after="0" w:line="240" w:lineRule="auto"/>
-      <w:ind w:left="0" w:right="0" w:firstLine="0"/>
-      <w:jc w:val="left"/>
-      <w:outlineLvl w:val="9"/>
+      <w:keepNext/>
     </w:pPr>
     <w:rPr>
-      <w:rFonts w:ascii="Arial Unicode MS" w:cs="Helvetica Neue" w:hAnsi="Arial Unicode MS" w:eastAsia="Arial Unicode MS" w:hint="cs"/>
-      <w:b w:val="0"/>
-      <w:bCs w:val="0"/>
-      <w:i w:val="0"/>
-      <w:iCs w:val="0"/>
-      <w:caps w:val="0"/>
-      <w:smallCaps w:val="0"/>
-      <w:strike w:val="0"/>
-      <w:dstrike w:val="0"/>
-      <w:outline w:val="0"/>
-      <w:color w:val="000000"/>
-      <w:spacing w:val="0"/>
-      <w:kern w:val="0"/>
-      <w:position w:val="0"/>
-      <w:sz w:val="22"/>
-      <w:szCs w:val="22"/>
-      <w:u w:val="none"/>
-      <w:shd w:val="nil" w:color="auto" w:fill="auto"/>
-      <w:vertAlign w:val="baseline"/>
-      <w14:textOutline>
+      <w:rFonts w:ascii="Helvetica Neue" w:eastAsia="Helvetica Neue" w:hAnsi="Helvetica Neue" w:cs="Helvetica Neue"/>
+      <w:b/>
+      <w:bCs/>
+      <w:color w:val="FFFFFF"/>
+      <w14:textOutline w14:w="0" w14:cap="flat" w14:cmpd="sng" w14:algn="ctr">
         <w14:noFill/>
+        <w14:prstDash w14:val="solid"/>
+        <w14:bevel/>
       </w14:textOutline>
-      <w14:textFill>
-        <w14:solidFill>
-          <w14:srgbClr w14:val="000000"/>
-        </w14:solidFill>
-      </w14:textFill>
     </w:rPr>
   </w:style>
-  <w:style w:type="paragraph" w:styleId="Table Style 3">
-    <w:name w:val="Table Style 3"/>
-    <w:next w:val="Table Style 3"/>
+  <w:style w:type="paragraph" w:customStyle="1" w:styleId="TableStyle4">
+    <w:name w:val="Table Style 4"/>
     <w:pPr>
-      <w:keepNext w:val="1"/>
-      <w:keepLines w:val="0"/>
-      <w:pageBreakBefore w:val="0"/>
-      <w:widowControl w:val="1"/>
-      <w:shd w:val="clear" w:color="auto" w:fill="auto"/>
-      <w:suppressAutoHyphens w:val="0"/>
-      <w:bidi w:val="0"/>
-      <w:spacing w:before="0" w:after="0" w:line="240" w:lineRule="auto"/>
-      <w:ind w:left="0" w:right="0" w:firstLine="0"/>
-      <w:jc w:val="left"/>
-      <w:outlineLvl w:val="9"/>
+      <w:keepLines/>
     </w:pPr>
     <w:rPr>
-      <w:rFonts w:ascii="Helvetica Neue" w:cs="Helvetica Neue" w:hAnsi="Helvetica Neue" w:eastAsia="Helvetica Neue"/>
-      <w:b w:val="1"/>
-      <w:bCs w:val="1"/>
-      <w:i w:val="0"/>
-      <w:iCs w:val="0"/>
-      <w:caps w:val="0"/>
-      <w:smallCaps w:val="0"/>
-      <w:strike w:val="0"/>
-      <w:dstrike w:val="0"/>
-      <w:outline w:val="0"/>
-      <w:color w:val="fefffe"/>
-      <w:spacing w:val="0"/>
-      <w:kern w:val="0"/>
-      <w:position w:val="0"/>
-      <w:sz w:val="20"/>
-      <w:szCs w:val="20"/>
-      <w:u w:val="none"/>
-      <w:shd w:val="nil" w:color="auto" w:fill="auto"/>
-      <w:vertAlign w:val="baseline"/>
-      <w14:textOutline>
+      <w:rFonts w:ascii="Helvetica Neue Medium" w:eastAsia="Helvetica Neue Medium" w:hAnsi="Helvetica Neue Medium" w:cs="Helvetica Neue Medium"/>
+      <w:color w:val="000000"/>
+      <w14:textOutline w14:w="0" w14:cap="flat" w14:cmpd="sng" w14:algn="ctr">
         <w14:noFill/>
+        <w14:prstDash w14:val="solid"/>
+        <w14:bevel/>
       </w14:textOutline>
-      <w14:textFill>
-        <w14:solidFill>
-          <w14:srgbClr w14:val="FFFFFF"/>
-        </w14:solidFill>
-      </w14:textFill>
     </w:rPr>
   </w:style>
-  <w:style w:type="paragraph" w:styleId="Table Style 4">
-    <w:name w:val="Table Style 4"/>
-    <w:next w:val="Table Style 4"/>
-    <w:pPr>
-      <w:keepNext w:val="0"/>
-      <w:keepLines w:val="1"/>
-      <w:pageBreakBefore w:val="0"/>
-      <w:widowControl w:val="1"/>
-      <w:shd w:val="clear" w:color="auto" w:fill="auto"/>
-      <w:suppressAutoHyphens w:val="0"/>
-      <w:bidi w:val="0"/>
-      <w:spacing w:before="0" w:after="0" w:line="240" w:lineRule="auto"/>
-      <w:ind w:left="0" w:right="0" w:firstLine="0"/>
-      <w:jc w:val="left"/>
-      <w:outlineLvl w:val="9"/>
-    </w:pPr>
+  <w:style w:type="paragraph" w:customStyle="1" w:styleId="TableStyle2">
+    <w:name w:val="Table Style 2"/>
     <w:rPr>
-      <w:rFonts w:ascii="Helvetica Neue Medium" w:cs="Helvetica Neue Medium" w:hAnsi="Helvetica Neue Medium" w:eastAsia="Helvetica Neue Medium"/>
-      <w:b w:val="0"/>
-      <w:bCs w:val="0"/>
-      <w:i w:val="0"/>
-      <w:iCs w:val="0"/>
-      <w:caps w:val="0"/>
-      <w:smallCaps w:val="0"/>
-      <w:strike w:val="0"/>
-      <w:dstrike w:val="0"/>
-      <w:outline w:val="0"/>
+      <w:rFonts w:ascii="Helvetica Neue" w:eastAsia="Helvetica Neue" w:hAnsi="Helvetica Neue" w:cs="Helvetica Neue"/>
       <w:color w:val="000000"/>
-      <w:spacing w:val="0"/>
-      <w:kern w:val="0"/>
-      <w:position w:val="0"/>
-      <w:sz w:val="20"/>
-      <w:szCs w:val="20"/>
-      <w:u w:val="none"/>
-      <w:shd w:val="nil" w:color="auto" w:fill="auto"/>
-      <w:vertAlign w:val="baseline"/>
-      <w14:textOutline>
+      <w14:textOutline w14:w="0" w14:cap="flat" w14:cmpd="sng" w14:algn="ctr">
         <w14:noFill/>
+        <w14:prstDash w14:val="solid"/>
+        <w14:bevel/>
       </w14:textOutline>
-      <w14:textFill>
-        <w14:solidFill>
-          <w14:srgbClr w14:val="000000"/>
-        </w14:solidFill>
-      </w14:textFill>
     </w:rPr>
   </w:style>
-  <w:style w:type="paragraph" w:styleId="Table Style 2">
-    <w:name w:val="Table Style 2"/>
-    <w:next w:val="Table Style 2"/>
+  <w:style w:type="paragraph" w:styleId="Header">
+    <w:name w:val="header"/>
+    <w:basedOn w:val="Normal"/>
+    <w:link w:val="HeaderChar"/>
+    <w:uiPriority w:val="99"/>
+    <w:unhideWhenUsed/>
+    <w:rsid w:val="009A0C6A"/>
     <w:pPr>
-      <w:keepNext w:val="0"/>
-      <w:keepLines w:val="0"/>
-      <w:pageBreakBefore w:val="0"/>
-      <w:widowControl w:val="1"/>
-      <w:shd w:val="clear" w:color="auto" w:fill="auto"/>
-      <w:suppressAutoHyphens w:val="0"/>
-      <w:bidi w:val="0"/>
-      <w:spacing w:before="0" w:after="0" w:line="240" w:lineRule="auto"/>
-      <w:ind w:left="0" w:right="0" w:firstLine="0"/>
-      <w:jc w:val="left"/>
-      <w:outlineLvl w:val="9"/>
+      <w:tabs>
+        <w:tab w:val="center" w:pos="4680"/>
+        <w:tab w:val="right" w:pos="9360"/>
+      </w:tabs>
     </w:pPr>
+  </w:style>
+  <w:style w:type="character" w:customStyle="1" w:styleId="HeaderChar">
+    <w:name w:val="Header Char"/>
+    <w:basedOn w:val="DefaultParagraphFont"/>
+    <w:link w:val="Header"/>
+    <w:uiPriority w:val="99"/>
+    <w:rsid w:val="009A0C6A"/>
     <w:rPr>
-      <w:rFonts w:ascii="Helvetica Neue" w:cs="Helvetica Neue" w:hAnsi="Helvetica Neue" w:eastAsia="Helvetica Neue"/>
-      <w:b w:val="0"/>
-      <w:bCs w:val="0"/>
-      <w:i w:val="0"/>
-      <w:iCs w:val="0"/>
-      <w:caps w:val="0"/>
-      <w:smallCaps w:val="0"/>
-      <w:strike w:val="0"/>
-      <w:dstrike w:val="0"/>
-      <w:outline w:val="0"/>
-      <w:color w:val="000000"/>
-      <w:spacing w:val="0"/>
-      <w:kern w:val="0"/>
-      <w:position w:val="0"/>
-      <w:sz w:val="20"/>
-      <w:szCs w:val="20"/>
-      <w:u w:val="none"/>
-      <w:shd w:val="nil" w:color="auto" w:fill="auto"/>
-      <w:vertAlign w:val="baseline"/>
-      <w14:textOutline>
-        <w14:noFill/>
-      </w14:textOutline>
-      <w14:textFill>
-        <w14:solidFill>
-          <w14:srgbClr w14:val="000000"/>
-        </w14:solidFill>
-      </w14:textFill>
+      <w:sz w:val="24"/>
+      <w:szCs w:val="24"/>
+    </w:rPr>
+  </w:style>
+  <w:style w:type="paragraph" w:styleId="Footer">
+    <w:name w:val="footer"/>
+    <w:basedOn w:val="Normal"/>
+    <w:link w:val="FooterChar"/>
+    <w:uiPriority w:val="99"/>
+    <w:unhideWhenUsed/>
+    <w:rsid w:val="009A0C6A"/>
+    <w:pPr>
+      <w:tabs>
+        <w:tab w:val="center" w:pos="4680"/>
+        <w:tab w:val="right" w:pos="9360"/>
+      </w:tabs>
+    </w:pPr>
+  </w:style>
+  <w:style w:type="character" w:customStyle="1" w:styleId="FooterChar">
+    <w:name w:val="Footer Char"/>
+    <w:basedOn w:val="DefaultParagraphFont"/>
+    <w:link w:val="Footer"/>
+    <w:uiPriority w:val="99"/>
+    <w:rsid w:val="009A0C6A"/>
+    <w:rPr>
+      <w:sz w:val="24"/>
+      <w:szCs w:val="24"/>
     </w:rPr>
   </w:style>
 </w:styles>
 </file>
 
 <file path=word/theme/theme1.xml><?xml version="1.0" encoding="utf-8"?>
-<a:theme xmlns:a="http://schemas.openxmlformats.org/drawingml/2006/main" xmlns:r="http://schemas.openxmlformats.org/officeDocument/2006/relationships" name="Blank">
+<a:theme xmlns:a="http://schemas.openxmlformats.org/drawingml/2006/main" name="Blank">
   <a:themeElements>
     <a:clrScheme name="Blank">
       <a:dk1>
@@ -1362,7 +1757,7 @@
         <a:effectLst/>
         <a:sp3d/>
       </a:spPr>
-      <a:bodyPr rot="0" spcFirstLastPara="1" vertOverflow="overflow" horzOverflow="overflow" vert="horz" wrap="square" lIns="50800" tIns="50800" rIns="50800" bIns="50800" numCol="1" spcCol="38100" rtlCol="0" anchor="ctr" upright="0">
+      <a:bodyPr rot="0" spcFirstLastPara="1" vertOverflow="overflow" horzOverflow="overflow" vert="horz" wrap="square" lIns="50800" tIns="50800" rIns="50800" bIns="50800" numCol="1" spcCol="38100" rtlCol="0" anchor="ctr">
         <a:spAutoFit/>
       </a:bodyPr>
       <a:lstStyle>
@@ -1381,7 +1776,7 @@
           <a:buFontTx/>
           <a:buNone/>
           <a:tabLst/>
-          <a:defRPr b="0" baseline="0" cap="none" i="0" spc="0" strike="noStrike" sz="1200" u="none" kumimoji="0" normalizeH="0">
+          <a:defRPr kumimoji="0" sz="1200" b="0" i="0" u="none" strike="noStrike" cap="none" spc="0" normalizeH="0" baseline="0">
             <a:ln>
               <a:noFill/>
             </a:ln>
@@ -1411,7 +1806,7 @@
           <a:buFontTx/>
           <a:buNone/>
           <a:tabLst/>
-          <a:defRPr b="0" baseline="0" cap="none" i="0" spc="0" strike="noStrike" sz="1800" u="none" kumimoji="0" normalizeH="0">
+          <a:defRPr kumimoji="0" sz="1800" b="0" i="0" u="none" strike="noStrike" cap="none" spc="0" normalizeH="0" baseline="0">
             <a:ln>
               <a:noFill/>
             </a:ln>
@@ -1437,7 +1832,7 @@
           <a:buFontTx/>
           <a:buNone/>
           <a:tabLst/>
-          <a:defRPr b="0" baseline="0" cap="none" i="0" spc="0" strike="noStrike" sz="1800" u="none" kumimoji="0" normalizeH="0">
+          <a:defRPr kumimoji="0" sz="1800" b="0" i="0" u="none" strike="noStrike" cap="none" spc="0" normalizeH="0" baseline="0">
             <a:ln>
               <a:noFill/>
             </a:ln>
@@ -1463,7 +1858,7 @@
           <a:buFontTx/>
           <a:buNone/>
           <a:tabLst/>
-          <a:defRPr b="0" baseline="0" cap="none" i="0" spc="0" strike="noStrike" sz="1800" u="none" kumimoji="0" normalizeH="0">
+          <a:defRPr kumimoji="0" sz="1800" b="0" i="0" u="none" strike="noStrike" cap="none" spc="0" normalizeH="0" baseline="0">
             <a:ln>
               <a:noFill/>
             </a:ln>
@@ -1489,7 +1884,7 @@
           <a:buFontTx/>
           <a:buNone/>
           <a:tabLst/>
-          <a:defRPr b="0" baseline="0" cap="none" i="0" spc="0" strike="noStrike" sz="1800" u="none" kumimoji="0" normalizeH="0">
+          <a:defRPr kumimoji="0" sz="1800" b="0" i="0" u="none" strike="noStrike" cap="none" spc="0" normalizeH="0" baseline="0">
             <a:ln>
               <a:noFill/>
             </a:ln>
@@ -1515,7 +1910,7 @@
           <a:buFontTx/>
           <a:buNone/>
           <a:tabLst/>
-          <a:defRPr b="0" baseline="0" cap="none" i="0" spc="0" strike="noStrike" sz="1800" u="none" kumimoji="0" normalizeH="0">
+          <a:defRPr kumimoji="0" sz="1800" b="0" i="0" u="none" strike="noStrike" cap="none" spc="0" normalizeH="0" baseline="0">
             <a:ln>
               <a:noFill/>
             </a:ln>
@@ -1541,7 +1936,7 @@
           <a:buFontTx/>
           <a:buNone/>
           <a:tabLst/>
-          <a:defRPr b="0" baseline="0" cap="none" i="0" spc="0" strike="noStrike" sz="1800" u="none" kumimoji="0" normalizeH="0">
+          <a:defRPr kumimoji="0" sz="1800" b="0" i="0" u="none" strike="noStrike" cap="none" spc="0" normalizeH="0" baseline="0">
             <a:ln>
               <a:noFill/>
             </a:ln>
@@ -1567,7 +1962,7 @@
           <a:buFontTx/>
           <a:buNone/>
           <a:tabLst/>
-          <a:defRPr b="0" baseline="0" cap="none" i="0" spc="0" strike="noStrike" sz="1800" u="none" kumimoji="0" normalizeH="0">
+          <a:defRPr kumimoji="0" sz="1800" b="0" i="0" u="none" strike="noStrike" cap="none" spc="0" normalizeH="0" baseline="0">
             <a:ln>
               <a:noFill/>
             </a:ln>
@@ -1593,7 +1988,7 @@
           <a:buFontTx/>
           <a:buNone/>
           <a:tabLst/>
-          <a:defRPr b="0" baseline="0" cap="none" i="0" spc="0" strike="noStrike" sz="1800" u="none" kumimoji="0" normalizeH="0">
+          <a:defRPr kumimoji="0" sz="1800" b="0" i="0" u="none" strike="noStrike" cap="none" spc="0" normalizeH="0" baseline="0">
             <a:ln>
               <a:noFill/>
             </a:ln>
@@ -1619,7 +2014,7 @@
           <a:buFontTx/>
           <a:buNone/>
           <a:tabLst/>
-          <a:defRPr b="0" baseline="0" cap="none" i="0" spc="0" strike="noStrike" sz="1800" u="none" kumimoji="0" normalizeH="0">
+          <a:defRPr kumimoji="0" sz="1800" b="0" i="0" u="none" strike="noStrike" cap="none" spc="0" normalizeH="0" baseline="0">
             <a:ln>
               <a:noFill/>
             </a:ln>
@@ -1632,9 +2027,15 @@
         </a:lvl9pPr>
       </a:lstStyle>
       <a:style>
-        <a:lnRef idx="0"/>
-        <a:fillRef idx="0"/>
-        <a:effectRef idx="0"/>
+        <a:lnRef idx="0">
+          <a:scrgbClr r="0" g="0" b="0"/>
+        </a:lnRef>
+        <a:fillRef idx="0">
+          <a:scrgbClr r="0" g="0" b="0"/>
+        </a:fillRef>
+        <a:effectRef idx="0">
+          <a:scrgbClr r="0" g="0" b="0"/>
+        </a:effectRef>
         <a:fontRef idx="none"/>
       </a:style>
     </a:spDef>
@@ -1651,7 +2052,7 @@
         <a:effectLst/>
         <a:sp3d/>
       </a:spPr>
-      <a:bodyPr rot="0" spcFirstLastPara="1" vertOverflow="overflow" horzOverflow="overflow" vert="horz" wrap="square" lIns="91439" tIns="45719" rIns="91439" bIns="45719" numCol="1" spcCol="38100" rtlCol="0" anchor="t" upright="0">
+      <a:bodyPr rot="0" spcFirstLastPara="1" vertOverflow="overflow" horzOverflow="overflow" vert="horz" wrap="square" lIns="91439" tIns="45719" rIns="91439" bIns="45719" numCol="1" spcCol="38100" rtlCol="0" anchor="t">
         <a:noAutofit/>
       </a:bodyPr>
       <a:lstStyle>
@@ -1670,7 +2071,7 @@
           <a:buFontTx/>
           <a:buNone/>
           <a:tabLst/>
-          <a:defRPr b="0" baseline="0" cap="none" i="0" spc="0" strike="noStrike" sz="1800" u="none" kumimoji="0" normalizeH="0">
+          <a:defRPr kumimoji="0" sz="1800" b="0" i="0" u="none" strike="noStrike" cap="none" spc="0" normalizeH="0" baseline="0">
             <a:ln>
               <a:noFill/>
             </a:ln>
@@ -1696,7 +2097,7 @@
           <a:buFontTx/>
           <a:buNone/>
           <a:tabLst/>
-          <a:defRPr b="0" baseline="0" cap="none" i="0" spc="0" strike="noStrike" sz="1800" u="none" kumimoji="0" normalizeH="0">
+          <a:defRPr kumimoji="0" sz="1800" b="0" i="0" u="none" strike="noStrike" cap="none" spc="0" normalizeH="0" baseline="0">
             <a:ln>
               <a:noFill/>
             </a:ln>
@@ -1722,7 +2123,7 @@
           <a:buFontTx/>
           <a:buNone/>
           <a:tabLst/>
-          <a:defRPr b="0" baseline="0" cap="none" i="0" spc="0" strike="noStrike" sz="1800" u="none" kumimoji="0" normalizeH="0">
+          <a:defRPr kumimoji="0" sz="1800" b="0" i="0" u="none" strike="noStrike" cap="none" spc="0" normalizeH="0" baseline="0">
             <a:ln>
               <a:noFill/>
             </a:ln>
@@ -1748,7 +2149,7 @@
           <a:buFontTx/>
           <a:buNone/>
           <a:tabLst/>
-          <a:defRPr b="0" baseline="0" cap="none" i="0" spc="0" strike="noStrike" sz="1800" u="none" kumimoji="0" normalizeH="0">
+          <a:defRPr kumimoji="0" sz="1800" b="0" i="0" u="none" strike="noStrike" cap="none" spc="0" normalizeH="0" baseline="0">
             <a:ln>
               <a:noFill/>
             </a:ln>
@@ -1774,7 +2175,7 @@
           <a:buFontTx/>
           <a:buNone/>
           <a:tabLst/>
-          <a:defRPr b="0" baseline="0" cap="none" i="0" spc="0" strike="noStrike" sz="1800" u="none" kumimoji="0" normalizeH="0">
+          <a:defRPr kumimoji="0" sz="1800" b="0" i="0" u="none" strike="noStrike" cap="none" spc="0" normalizeH="0" baseline="0">
             <a:ln>
               <a:noFill/>
             </a:ln>
@@ -1800,7 +2201,7 @@
           <a:buFontTx/>
           <a:buNone/>
           <a:tabLst/>
-          <a:defRPr b="0" baseline="0" cap="none" i="0" spc="0" strike="noStrike" sz="1800" u="none" kumimoji="0" normalizeH="0">
+          <a:defRPr kumimoji="0" sz="1800" b="0" i="0" u="none" strike="noStrike" cap="none" spc="0" normalizeH="0" baseline="0">
             <a:ln>
               <a:noFill/>
             </a:ln>
@@ -1826,7 +2227,7 @@
           <a:buFontTx/>
           <a:buNone/>
           <a:tabLst/>
-          <a:defRPr b="0" baseline="0" cap="none" i="0" spc="0" strike="noStrike" sz="1800" u="none" kumimoji="0" normalizeH="0">
+          <a:defRPr kumimoji="0" sz="1800" b="0" i="0" u="none" strike="noStrike" cap="none" spc="0" normalizeH="0" baseline="0">
             <a:ln>
               <a:noFill/>
             </a:ln>
@@ -1852,7 +2253,7 @@
           <a:buFontTx/>
           <a:buNone/>
           <a:tabLst/>
-          <a:defRPr b="0" baseline="0" cap="none" i="0" spc="0" strike="noStrike" sz="1800" u="none" kumimoji="0" normalizeH="0">
+          <a:defRPr kumimoji="0" sz="1800" b="0" i="0" u="none" strike="noStrike" cap="none" spc="0" normalizeH="0" baseline="0">
             <a:ln>
               <a:noFill/>
             </a:ln>
@@ -1878,7 +2279,7 @@
           <a:buFontTx/>
           <a:buNone/>
           <a:tabLst/>
-          <a:defRPr b="0" baseline="0" cap="none" i="0" spc="0" strike="noStrike" sz="1800" u="none" kumimoji="0" normalizeH="0">
+          <a:defRPr kumimoji="0" sz="1800" b="0" i="0" u="none" strike="noStrike" cap="none" spc="0" normalizeH="0" baseline="0">
             <a:ln>
               <a:noFill/>
             </a:ln>
@@ -1904,7 +2305,7 @@
           <a:buFontTx/>
           <a:buNone/>
           <a:tabLst/>
-          <a:defRPr b="0" baseline="0" cap="none" i="0" spc="0" strike="noStrike" sz="1800" u="none" kumimoji="0" normalizeH="0">
+          <a:defRPr kumimoji="0" sz="1800" b="0" i="0" u="none" strike="noStrike" cap="none" spc="0" normalizeH="0" baseline="0">
             <a:ln>
               <a:noFill/>
             </a:ln>
@@ -1917,9 +2318,15 @@
         </a:lvl9pPr>
       </a:lstStyle>
       <a:style>
-        <a:lnRef idx="0"/>
-        <a:fillRef idx="0"/>
-        <a:effectRef idx="0"/>
+        <a:lnRef idx="0">
+          <a:scrgbClr r="0" g="0" b="0"/>
+        </a:lnRef>
+        <a:fillRef idx="0">
+          <a:scrgbClr r="0" g="0" b="0"/>
+        </a:fillRef>
+        <a:effectRef idx="0">
+          <a:scrgbClr r="0" g="0" b="0"/>
+        </a:effectRef>
         <a:fontRef idx="none"/>
       </a:style>
     </a:lnDef>
@@ -1933,7 +2340,7 @@
         <a:effectLst/>
         <a:sp3d/>
       </a:spPr>
-      <a:bodyPr rot="0" spcFirstLastPara="1" vertOverflow="overflow" horzOverflow="overflow" vert="horz" wrap="square" lIns="50800" tIns="50800" rIns="50800" bIns="50800" numCol="1" spcCol="38100" rtlCol="0" anchor="t" upright="0">
+      <a:bodyPr rot="0" spcFirstLastPara="1" vertOverflow="overflow" horzOverflow="overflow" vert="horz" wrap="square" lIns="50800" tIns="50800" rIns="50800" bIns="50800" numCol="1" spcCol="38100" rtlCol="0" anchor="t">
         <a:spAutoFit/>
       </a:bodyPr>
       <a:lstStyle>
@@ -1952,7 +2359,7 @@
           <a:buFontTx/>
           <a:buNone/>
           <a:tabLst/>
-          <a:defRPr b="0" baseline="0" cap="none" i="0" spc="0" strike="noStrike" sz="1100" u="none" kumimoji="0" normalizeH="0">
+          <a:defRPr kumimoji="0" sz="1100" b="0" i="0" u="none" strike="noStrike" cap="none" spc="0" normalizeH="0" baseline="0">
             <a:ln>
               <a:noFill/>
             </a:ln>
@@ -1982,7 +2389,7 @@
           <a:buFontTx/>
           <a:buNone/>
           <a:tabLst/>
-          <a:defRPr b="0" baseline="0" cap="none" i="0" spc="0" strike="noStrike" sz="1800" u="none" kumimoji="0" normalizeH="0">
+          <a:defRPr kumimoji="0" sz="1800" b="0" i="0" u="none" strike="noStrike" cap="none" spc="0" normalizeH="0" baseline="0">
             <a:ln>
               <a:noFill/>
             </a:ln>
@@ -2008,7 +2415,7 @@
           <a:buFontTx/>
           <a:buNone/>
           <a:tabLst/>
-          <a:defRPr b="0" baseline="0" cap="none" i="0" spc="0" strike="noStrike" sz="1800" u="none" kumimoji="0" normalizeH="0">
+          <a:defRPr kumimoji="0" sz="1800" b="0" i="0" u="none" strike="noStrike" cap="none" spc="0" normalizeH="0" baseline="0">
             <a:ln>
               <a:noFill/>
             </a:ln>
@@ -2034,7 +2441,7 @@
           <a:buFontTx/>
           <a:buNone/>
           <a:tabLst/>
-          <a:defRPr b="0" baseline="0" cap="none" i="0" spc="0" strike="noStrike" sz="1800" u="none" kumimoji="0" normalizeH="0">
+          <a:defRPr kumimoji="0" sz="1800" b="0" i="0" u="none" strike="noStrike" cap="none" spc="0" normalizeH="0" baseline="0">
             <a:ln>
               <a:noFill/>
             </a:ln>
@@ -2060,7 +2467,7 @@
           <a:buFontTx/>
           <a:buNone/>
           <a:tabLst/>
-          <a:defRPr b="0" baseline="0" cap="none" i="0" spc="0" strike="noStrike" sz="1800" u="none" kumimoji="0" normalizeH="0">
+          <a:defRPr kumimoji="0" sz="1800" b="0" i="0" u="none" strike="noStrike" cap="none" spc="0" normalizeH="0" baseline="0">
             <a:ln>
               <a:noFill/>
             </a:ln>
@@ -2086,7 +2493,7 @@
           <a:buFontTx/>
           <a:buNone/>
           <a:tabLst/>
-          <a:defRPr b="0" baseline="0" cap="none" i="0" spc="0" strike="noStrike" sz="1800" u="none" kumimoji="0" normalizeH="0">
+          <a:defRPr kumimoji="0" sz="1800" b="0" i="0" u="none" strike="noStrike" cap="none" spc="0" normalizeH="0" baseline="0">
             <a:ln>
               <a:noFill/>
             </a:ln>
@@ -2112,7 +2519,7 @@
           <a:buFontTx/>
           <a:buNone/>
           <a:tabLst/>
-          <a:defRPr b="0" baseline="0" cap="none" i="0" spc="0" strike="noStrike" sz="1800" u="none" kumimoji="0" normalizeH="0">
+          <a:defRPr kumimoji="0" sz="1800" b="0" i="0" u="none" strike="noStrike" cap="none" spc="0" normalizeH="0" baseline="0">
             <a:ln>
               <a:noFill/>
             </a:ln>
@@ -2138,7 +2545,7 @@
           <a:buFontTx/>
           <a:buNone/>
           <a:tabLst/>
-          <a:defRPr b="0" baseline="0" cap="none" i="0" spc="0" strike="noStrike" sz="1800" u="none" kumimoji="0" normalizeH="0">
+          <a:defRPr kumimoji="0" sz="1800" b="0" i="0" u="none" strike="noStrike" cap="none" spc="0" normalizeH="0" baseline="0">
             <a:ln>
               <a:noFill/>
             </a:ln>
@@ -2164,7 +2571,7 @@
           <a:buFontTx/>
           <a:buNone/>
           <a:tabLst/>
-          <a:defRPr b="0" baseline="0" cap="none" i="0" spc="0" strike="noStrike" sz="1800" u="none" kumimoji="0" normalizeH="0">
+          <a:defRPr kumimoji="0" sz="1800" b="0" i="0" u="none" strike="noStrike" cap="none" spc="0" normalizeH="0" baseline="0">
             <a:ln>
               <a:noFill/>
             </a:ln>
@@ -2190,7 +2597,7 @@
           <a:buFontTx/>
           <a:buNone/>
           <a:tabLst/>
-          <a:defRPr b="0" baseline="0" cap="none" i="0" spc="0" strike="noStrike" sz="1800" u="none" kumimoji="0" normalizeH="0">
+          <a:defRPr kumimoji="0" sz="1800" b="0" i="0" u="none" strike="noStrike" cap="none" spc="0" normalizeH="0" baseline="0">
             <a:ln>
               <a:noFill/>
             </a:ln>
@@ -2203,12 +2610,19 @@
         </a:lvl9pPr>
       </a:lstStyle>
       <a:style>
-        <a:lnRef idx="0"/>
-        <a:fillRef idx="0"/>
-        <a:effectRef idx="0"/>
+        <a:lnRef idx="0">
+          <a:scrgbClr r="0" g="0" b="0"/>
+        </a:lnRef>
+        <a:fillRef idx="0">
+          <a:scrgbClr r="0" g="0" b="0"/>
+        </a:fillRef>
+        <a:effectRef idx="0">
+          <a:scrgbClr r="0" g="0" b="0"/>
+        </a:effectRef>
         <a:fontRef idx="none"/>
       </a:style>
     </a:txDef>
   </a:objectDefaults>
+  <a:extraClrSchemeLst/>
 </a:theme>
 </file>
</xml_diff>

<commit_message>
Arrange Task Infos; Update standards
</commit_message>
<xml_diff>
--- a/Documentation/Analysis/Project Standards/Project standards - W.docx
+++ b/Documentation/Analysis/Project Standards/Project standards - W.docx
@@ -794,7 +794,31 @@
                 <w:rtl w:val="0"/>
                 <w:lang w:val="en-US"/>
               </w:rPr>
-              <w:t>Pagges</w:t>
+              <w:t>Pa</w:t>
+            </w:r>
+            <w:r>
+              <w:rPr>
+                <w:rFonts w:ascii="Arial Unicode MS" w:cs="Arial Unicode MS" w:hAnsi="Arial Unicode MS" w:eastAsia="Arial Unicode MS"/>
+                <w:b w:val="0"/>
+                <w:bCs w:val="0"/>
+                <w:i w:val="0"/>
+                <w:iCs w:val="0"/>
+                <w:rtl w:val="0"/>
+                <w:lang w:val="en-US"/>
+              </w:rPr>
+              <w:t>g</w:t>
+            </w:r>
+            <w:r>
+              <w:rPr>
+                <w:rFonts w:ascii="Arial Unicode MS" w:cs="Arial Unicode MS" w:hAnsi="Arial Unicode MS" w:eastAsia="Arial Unicode MS"/>
+                <w:b w:val="0"/>
+                <w:bCs w:val="0"/>
+                <w:i w:val="0"/>
+                <w:iCs w:val="0"/>
+                <w:rtl w:val="0"/>
+                <w:lang w:val="en-US"/>
+              </w:rPr>
+              <w:t>es</w:t>
             </w:r>
             <w:r>
               <w:rPr>
@@ -915,7 +939,7 @@
           <w:shd w:val="clear" w:color="auto" w:fill="cadfff"/>
         </w:tblPrEx>
         <w:trPr>
-          <w:trHeight w:val="1444" w:hRule="atLeast"/>
+          <w:trHeight w:val="1214" w:hRule="atLeast"/>
         </w:trPr>
         <w:tc>
           <w:tcPr>
@@ -1025,45 +1049,6 @@
             </w:tcMar>
             <w:vAlign w:val="top"/>
           </w:tcPr>
-          <w:p>
-            <w:pPr>
-              <w:pStyle w:val="Table Style 2 A"/>
-              <w:numPr>
-                <w:ilvl w:val="0"/>
-                <w:numId w:val="1"/>
-              </w:numPr>
-              <w:rPr>
-                <w:lang w:val="en-US"/>
-              </w:rPr>
-            </w:pPr>
-            <w:r>
-              <w:rPr>
-                <w:rFonts w:ascii="Helvetica Neue" w:hAnsi="Helvetica Neue"/>
-                <w:shd w:val="nil" w:color="auto" w:fill="auto"/>
-                <w:rtl w:val="0"/>
-                <w:lang w:val="en-US"/>
-              </w:rPr>
-              <w:t xml:space="preserve">If working with Pages -&gt; </w:t>
-            </w:r>
-            <w:r>
-              <w:rPr>
-                <w:rFonts w:ascii="Helvetica Neue" w:hAnsi="Helvetica Neue"/>
-                <w:shd w:val="nil" w:color="auto" w:fill="auto"/>
-                <w:rtl w:val="0"/>
-                <w:lang w:val="en-US"/>
-              </w:rPr>
-              <w:t>export</w:t>
-            </w:r>
-            <w:r>
-              <w:rPr>
-                <w:rFonts w:ascii="Helvetica Neue" w:hAnsi="Helvetica Neue"/>
-                <w:shd w:val="nil" w:color="auto" w:fill="auto"/>
-                <w:rtl w:val="0"/>
-                <w:lang w:val="en-US"/>
-              </w:rPr>
-              <w:t xml:space="preserve"> a  .docx and a .pdf version of the latest changes with naming standards as above.</w:t>
-            </w:r>
-          </w:p>
           <w:p>
             <w:pPr>
               <w:pStyle w:val="Table Style 2 A"/>
@@ -2332,6 +2317,577 @@
               <w:t>5</w:t>
             </w:r>
           </w:p>
+        </w:tc>
+      </w:tr>
+      <w:tr>
+        <w:tblPrEx>
+          <w:shd w:val="clear" w:color="auto" w:fill="cadfff"/>
+        </w:tblPrEx>
+        <w:trPr>
+          <w:trHeight w:val="557" w:hRule="atLeast"/>
+        </w:trPr>
+        <w:tc>
+          <w:tcPr>
+            <w:tcW w:type="dxa" w:w="3065"/>
+            <w:gridSpan w:val="2"/>
+            <w:tcBorders>
+              <w:top w:val="single" w:color="929292" w:sz="4" w:space="0" w:shadow="0" w:frame="0"/>
+              <w:left w:val="single" w:color="89847f" w:sz="8" w:space="0" w:shadow="0" w:frame="0"/>
+              <w:bottom w:val="single" w:color="929292" w:sz="4" w:space="0" w:shadow="0" w:frame="0"/>
+              <w:right w:val="single" w:color="89847f" w:sz="8" w:space="0" w:shadow="0" w:frame="0"/>
+            </w:tcBorders>
+            <w:shd w:val="clear" w:color="auto" w:fill="auto"/>
+            <w:tcMar>
+              <w:top w:type="dxa" w:w="80"/>
+              <w:left w:type="dxa" w:w="80"/>
+              <w:bottom w:type="dxa" w:w="80"/>
+              <w:right w:type="dxa" w:w="80"/>
+            </w:tcMar>
+            <w:vAlign w:val="center"/>
+          </w:tcPr>
+          <w:p>
+            <w:pPr>
+              <w:keepNext w:val="0"/>
+              <w:keepLines w:val="0"/>
+              <w:pageBreakBefore w:val="0"/>
+              <w:widowControl w:val="1"/>
+              <w:shd w:val="clear" w:color="auto" w:fill="auto"/>
+              <w:suppressAutoHyphens w:val="1"/>
+              <w:bidi w:val="0"/>
+              <w:spacing w:before="0" w:after="0" w:line="240" w:lineRule="auto"/>
+              <w:ind w:left="0" w:right="0" w:firstLine="0"/>
+              <w:jc w:val="left"/>
+              <w:outlineLvl w:val="0"/>
+              <w:rPr>
+                <w:rtl w:val="0"/>
+              </w:rPr>
+            </w:pPr>
+            <w:r>
+              <w:rPr>
+                <w:rFonts w:ascii="Arial Unicode MS" w:cs="Arial Unicode MS" w:hAnsi="Arial Unicode MS" w:eastAsia="Arial Unicode MS"/>
+                <w:b w:val="0"/>
+                <w:bCs w:val="0"/>
+                <w:i w:val="0"/>
+                <w:iCs w:val="0"/>
+                <w:caps w:val="0"/>
+                <w:smallCaps w:val="0"/>
+                <w:strike w:val="0"/>
+                <w:dstrike w:val="0"/>
+                <w:outline w:val="0"/>
+                <w:color w:val="000000"/>
+                <w:spacing w:val="0"/>
+                <w:kern w:val="0"/>
+                <w:position w:val="0"/>
+                <w:sz w:val="24"/>
+                <w:szCs w:val="24"/>
+                <w:u w:val="none" w:color="000000"/>
+                <w:shd w:val="nil" w:color="auto" w:fill="auto"/>
+                <w:vertAlign w:val="baseline"/>
+                <w:rtl w:val="0"/>
+                <w:lang w:val="de-DE"/>
+                <w14:textOutline>
+                  <w14:noFill/>
+                </w14:textOutline>
+                <w14:textFill>
+                  <w14:solidFill>
+                    <w14:srgbClr w14:val="000000"/>
+                  </w14:solidFill>
+                </w14:textFill>
+              </w:rPr>
+              <w:t>Task</w:t>
+            </w:r>
+            <w:r>
+              <w:rPr>
+                <w:rFonts w:ascii="Mj_Casablanca Light" w:cs="Arial Unicode MS" w:hAnsi="Mj_Casablanca Light" w:eastAsia="Arial Unicode MS"/>
+                <w:b w:val="0"/>
+                <w:bCs w:val="0"/>
+                <w:i w:val="0"/>
+                <w:iCs w:val="0"/>
+                <w:caps w:val="0"/>
+                <w:smallCaps w:val="0"/>
+                <w:strike w:val="0"/>
+                <w:dstrike w:val="0"/>
+                <w:outline w:val="0"/>
+                <w:color w:val="000000"/>
+                <w:spacing w:val="0"/>
+                <w:kern w:val="0"/>
+                <w:position w:val="0"/>
+                <w:sz w:val="24"/>
+                <w:szCs w:val="24"/>
+                <w:u w:val="none" w:color="000000"/>
+                <w:shd w:val="nil" w:color="auto" w:fill="auto"/>
+                <w:vertAlign w:val="baseline"/>
+                <w:rtl w:val="0"/>
+                <w14:textOutline>
+                  <w14:noFill/>
+                </w14:textOutline>
+                <w14:textFill>
+                  <w14:solidFill>
+                    <w14:srgbClr w14:val="000000"/>
+                  </w14:solidFill>
+                </w14:textFill>
+              </w:rPr>
+              <w:t xml:space="preserve"> </w:t>
+            </w:r>
+            <w:r>
+              <w:rPr>
+                <w:rFonts w:ascii="Arial Unicode MS" w:cs="Arial Unicode MS" w:hAnsi="Arial Unicode MS" w:eastAsia="Arial Unicode MS"/>
+                <w:b w:val="0"/>
+                <w:bCs w:val="0"/>
+                <w:i w:val="0"/>
+                <w:iCs w:val="0"/>
+                <w:caps w:val="0"/>
+                <w:smallCaps w:val="0"/>
+                <w:strike w:val="0"/>
+                <w:dstrike w:val="0"/>
+                <w:outline w:val="0"/>
+                <w:color w:val="000000"/>
+                <w:spacing w:val="0"/>
+                <w:kern w:val="0"/>
+                <w:position w:val="0"/>
+                <w:sz w:val="24"/>
+                <w:szCs w:val="24"/>
+                <w:u w:val="none" w:color="000000"/>
+                <w:shd w:val="nil" w:color="auto" w:fill="auto"/>
+                <w:vertAlign w:val="baseline"/>
+                <w:rtl w:val="0"/>
+                <w:lang w:val="en-US"/>
+                <w14:textOutline>
+                  <w14:noFill/>
+                </w14:textOutline>
+                <w14:textFill>
+                  <w14:solidFill>
+                    <w14:srgbClr w14:val="000000"/>
+                  </w14:solidFill>
+                </w14:textFill>
+              </w:rPr>
+              <w:t>Informati</w:t>
+            </w:r>
+            <w:r>
+              <w:rPr>
+                <w:rFonts w:ascii="Arial Unicode MS" w:cs="Arial Unicode MS" w:hAnsi="Arial Unicode MS" w:eastAsia="Arial Unicode MS"/>
+                <w:b w:val="0"/>
+                <w:bCs w:val="0"/>
+                <w:i w:val="0"/>
+                <w:iCs w:val="0"/>
+                <w:caps w:val="0"/>
+                <w:smallCaps w:val="0"/>
+                <w:strike w:val="0"/>
+                <w:dstrike w:val="0"/>
+                <w:outline w:val="0"/>
+                <w:color w:val="000000"/>
+                <w:spacing w:val="0"/>
+                <w:kern w:val="0"/>
+                <w:position w:val="0"/>
+                <w:sz w:val="24"/>
+                <w:szCs w:val="24"/>
+                <w:u w:val="none" w:color="000000"/>
+                <w:shd w:val="nil" w:color="auto" w:fill="auto"/>
+                <w:vertAlign w:val="baseline"/>
+                <w:rtl w:val="0"/>
+                <w:lang w:val="en-US"/>
+                <w14:textOutline>
+                  <w14:noFill/>
+                </w14:textOutline>
+                <w14:textFill>
+                  <w14:solidFill>
+                    <w14:srgbClr w14:val="000000"/>
+                  </w14:solidFill>
+                </w14:textFill>
+              </w:rPr>
+              <w:t>on</w:t>
+            </w:r>
+            <w:r>
+              <w:rPr>
+                <w:rFonts w:ascii="Mj_Casablanca Light" w:cs="Arial Unicode MS" w:hAnsi="Mj_Casablanca Light" w:eastAsia="Arial Unicode MS"/>
+                <w:b w:val="0"/>
+                <w:bCs w:val="0"/>
+                <w:i w:val="0"/>
+                <w:iCs w:val="0"/>
+                <w:caps w:val="0"/>
+                <w:smallCaps w:val="0"/>
+                <w:strike w:val="0"/>
+                <w:dstrike w:val="0"/>
+                <w:outline w:val="0"/>
+                <w:color w:val="000000"/>
+                <w:spacing w:val="0"/>
+                <w:kern w:val="0"/>
+                <w:position w:val="0"/>
+                <w:sz w:val="24"/>
+                <w:szCs w:val="24"/>
+                <w:u w:val="none" w:color="000000"/>
+                <w:shd w:val="nil" w:color="auto" w:fill="auto"/>
+                <w:vertAlign w:val="baseline"/>
+                <w:rtl w:val="0"/>
+                <w:lang w:val="en-US"/>
+                <w14:textOutline>
+                  <w14:noFill/>
+                </w14:textOutline>
+                <w14:textFill>
+                  <w14:solidFill>
+                    <w14:srgbClr w14:val="000000"/>
+                  </w14:solidFill>
+                </w14:textFill>
+              </w:rPr>
+              <w:t xml:space="preserve"> </w:t>
+            </w:r>
+            <w:r>
+              <w:rPr>
+                <w:rFonts w:ascii="Arial Unicode MS" w:cs="Arial Unicode MS" w:hAnsi="Arial Unicode MS" w:eastAsia="Arial Unicode MS"/>
+                <w:b w:val="0"/>
+                <w:bCs w:val="0"/>
+                <w:i w:val="0"/>
+                <w:iCs w:val="0"/>
+                <w:caps w:val="0"/>
+                <w:smallCaps w:val="0"/>
+                <w:strike w:val="0"/>
+                <w:dstrike w:val="0"/>
+                <w:outline w:val="0"/>
+                <w:color w:val="000000"/>
+                <w:spacing w:val="0"/>
+                <w:kern w:val="0"/>
+                <w:position w:val="0"/>
+                <w:sz w:val="24"/>
+                <w:szCs w:val="24"/>
+                <w:u w:val="none" w:color="000000"/>
+                <w:shd w:val="nil" w:color="auto" w:fill="auto"/>
+                <w:vertAlign w:val="baseline"/>
+                <w:rtl w:val="0"/>
+                <w:lang w:val="en-US"/>
+                <w14:textOutline>
+                  <w14:noFill/>
+                </w14:textOutline>
+                <w14:textFill>
+                  <w14:solidFill>
+                    <w14:srgbClr w14:val="000000"/>
+                  </w14:solidFill>
+                </w14:textFill>
+              </w:rPr>
+              <w:t>folders</w:t>
+            </w:r>
+          </w:p>
+        </w:tc>
+        <w:tc>
+          <w:tcPr>
+            <w:tcW w:type="dxa" w:w="5105"/>
+            <w:tcBorders>
+              <w:top w:val="single" w:color="929292" w:sz="4" w:space="0" w:shadow="0" w:frame="0"/>
+              <w:left w:val="single" w:color="89847f" w:sz="8" w:space="0" w:shadow="0" w:frame="0"/>
+              <w:bottom w:val="single" w:color="929292" w:sz="4" w:space="0" w:shadow="0" w:frame="0"/>
+              <w:right w:val="single" w:color="89847f" w:sz="8" w:space="0" w:shadow="0" w:frame="0"/>
+            </w:tcBorders>
+            <w:shd w:val="clear" w:color="auto" w:fill="e6efff"/>
+            <w:tcMar>
+              <w:top w:type="dxa" w:w="80"/>
+              <w:left w:type="dxa" w:w="80"/>
+              <w:bottom w:type="dxa" w:w="80"/>
+              <w:right w:type="dxa" w:w="80"/>
+            </w:tcMar>
+            <w:vAlign w:val="top"/>
+          </w:tcPr>
+          <w:p>
+            <w:pPr>
+              <w:keepNext w:val="0"/>
+              <w:keepLines w:val="0"/>
+              <w:pageBreakBefore w:val="0"/>
+              <w:widowControl w:val="1"/>
+              <w:shd w:val="clear" w:color="auto" w:fill="auto"/>
+              <w:suppressAutoHyphens w:val="0"/>
+              <w:bidi w:val="1"/>
+              <w:spacing w:before="0" w:after="0" w:line="240" w:lineRule="auto"/>
+              <w:ind w:left="0" w:right="0" w:firstLine="0"/>
+              <w:jc w:val="left"/>
+              <w:outlineLvl w:val="9"/>
+              <w:rPr>
+                <w:rtl w:val="1"/>
+              </w:rPr>
+            </w:pPr>
+            <w:r>
+              <w:rPr>
+                <w:rFonts w:ascii="Arial Unicode MS" w:cs="Mj_Casablanca Light" w:hAnsi="Arial Unicode MS" w:eastAsia="Arial Unicode MS" w:hint="cs"/>
+                <w:b w:val="0"/>
+                <w:bCs w:val="0"/>
+                <w:i w:val="0"/>
+                <w:iCs w:val="0"/>
+                <w:caps w:val="0"/>
+                <w:smallCaps w:val="0"/>
+                <w:strike w:val="0"/>
+                <w:dstrike w:val="0"/>
+                <w:outline w:val="0"/>
+                <w:color w:val="000000"/>
+                <w:spacing w:val="0"/>
+                <w:kern w:val="0"/>
+                <w:position w:val="0"/>
+                <w:sz w:val="24"/>
+                <w:szCs w:val="24"/>
+                <w:u w:val="none" w:color="000000"/>
+                <w:shd w:val="nil" w:color="auto" w:fill="auto"/>
+                <w:vertAlign w:val="baseline"/>
+                <w:rtl w:val="1"/>
+                <w14:textOutline>
+                  <w14:noFill/>
+                </w14:textOutline>
+                <w14:textFill>
+                  <w14:solidFill>
+                    <w14:srgbClr w14:val="000000"/>
+                  </w14:solidFill>
+                </w14:textFill>
+              </w:rPr>
+              <w:t xml:space="preserve">براساس وضعیت انجام، آنهارا در یکی از پوشه های </w:t>
+            </w:r>
+            <w:r>
+              <w:rPr>
+                <w:rFonts w:ascii="Mj_Casablanca Light" w:cs="Arial Unicode MS" w:hAnsi="Mj_Casablanca Light" w:eastAsia="Arial Unicode MS"/>
+                <w:b w:val="0"/>
+                <w:bCs w:val="0"/>
+                <w:i w:val="0"/>
+                <w:iCs w:val="0"/>
+                <w:caps w:val="0"/>
+                <w:smallCaps w:val="0"/>
+                <w:strike w:val="0"/>
+                <w:dstrike w:val="0"/>
+                <w:outline w:val="0"/>
+                <w:color w:val="000000"/>
+                <w:spacing w:val="0"/>
+                <w:kern w:val="0"/>
+                <w:position w:val="0"/>
+                <w:sz w:val="24"/>
+                <w:szCs w:val="24"/>
+                <w:u w:val="none" w:color="000000"/>
+                <w:shd w:val="nil" w:color="auto" w:fill="auto"/>
+                <w:vertAlign w:val="baseline"/>
+                <w:rtl w:val="0"/>
+                <w14:textOutline>
+                  <w14:noFill/>
+                </w14:textOutline>
+                <w14:textFill>
+                  <w14:solidFill>
+                    <w14:srgbClr w14:val="000000"/>
+                  </w14:solidFill>
+                </w14:textFill>
+              </w:rPr>
+              <w:t>Complete</w:t>
+            </w:r>
+            <w:r>
+              <w:rPr>
+                <w:rFonts w:ascii="Arial Unicode MS" w:cs="Mj_Casablanca Light" w:hAnsi="Arial Unicode MS" w:eastAsia="Arial Unicode MS" w:hint="cs"/>
+                <w:b w:val="0"/>
+                <w:bCs w:val="0"/>
+                <w:i w:val="0"/>
+                <w:iCs w:val="0"/>
+                <w:caps w:val="0"/>
+                <w:smallCaps w:val="0"/>
+                <w:strike w:val="0"/>
+                <w:dstrike w:val="0"/>
+                <w:outline w:val="0"/>
+                <w:color w:val="000000"/>
+                <w:spacing w:val="0"/>
+                <w:kern w:val="0"/>
+                <w:position w:val="0"/>
+                <w:sz w:val="24"/>
+                <w:szCs w:val="24"/>
+                <w:u w:val="none" w:color="000000"/>
+                <w:shd w:val="nil" w:color="auto" w:fill="auto"/>
+                <w:vertAlign w:val="baseline"/>
+                <w:rtl w:val="0"/>
+                <w:cs w:val="1"/>
+                <w14:textOutline>
+                  <w14:noFill/>
+                </w14:textOutline>
+                <w14:textFill>
+                  <w14:solidFill>
+                    <w14:srgbClr w14:val="000000"/>
+                  </w14:solidFill>
+                </w14:textFill>
+              </w:rPr>
+              <w:t xml:space="preserve">، </w:t>
+            </w:r>
+            <w:r>
+              <w:rPr>
+                <w:rFonts w:ascii="Mj_Casablanca Light" w:cs="Arial Unicode MS" w:hAnsi="Mj_Casablanca Light" w:eastAsia="Arial Unicode MS"/>
+                <w:b w:val="0"/>
+                <w:bCs w:val="0"/>
+                <w:i w:val="0"/>
+                <w:iCs w:val="0"/>
+                <w:caps w:val="0"/>
+                <w:smallCaps w:val="0"/>
+                <w:strike w:val="0"/>
+                <w:dstrike w:val="0"/>
+                <w:outline w:val="0"/>
+                <w:color w:val="000000"/>
+                <w:spacing w:val="0"/>
+                <w:kern w:val="0"/>
+                <w:position w:val="0"/>
+                <w:sz w:val="24"/>
+                <w:szCs w:val="24"/>
+                <w:u w:val="none" w:color="000000"/>
+                <w:shd w:val="nil" w:color="auto" w:fill="auto"/>
+                <w:vertAlign w:val="baseline"/>
+                <w:rtl w:val="0"/>
+                <w14:textOutline>
+                  <w14:noFill/>
+                </w14:textOutline>
+                <w14:textFill>
+                  <w14:solidFill>
+                    <w14:srgbClr w14:val="000000"/>
+                  </w14:solidFill>
+                </w14:textFill>
+              </w:rPr>
+              <w:t>In Progress</w:t>
+            </w:r>
+            <w:r>
+              <w:rPr>
+                <w:rFonts w:ascii="Arial Unicode MS" w:cs="Mj_Casablanca Light" w:hAnsi="Arial Unicode MS" w:eastAsia="Arial Unicode MS" w:hint="cs"/>
+                <w:b w:val="0"/>
+                <w:bCs w:val="0"/>
+                <w:i w:val="0"/>
+                <w:iCs w:val="0"/>
+                <w:caps w:val="0"/>
+                <w:smallCaps w:val="0"/>
+                <w:strike w:val="0"/>
+                <w:dstrike w:val="0"/>
+                <w:outline w:val="0"/>
+                <w:color w:val="000000"/>
+                <w:spacing w:val="0"/>
+                <w:kern w:val="0"/>
+                <w:position w:val="0"/>
+                <w:sz w:val="24"/>
+                <w:szCs w:val="24"/>
+                <w:u w:val="none" w:color="000000"/>
+                <w:shd w:val="nil" w:color="auto" w:fill="auto"/>
+                <w:vertAlign w:val="baseline"/>
+                <w:rtl w:val="1"/>
+                <w14:textOutline>
+                  <w14:noFill/>
+                </w14:textOutline>
+                <w14:textFill>
+                  <w14:solidFill>
+                    <w14:srgbClr w14:val="000000"/>
+                  </w14:solidFill>
+                </w14:textFill>
+              </w:rPr>
+              <w:t xml:space="preserve"> و </w:t>
+            </w:r>
+            <w:r>
+              <w:rPr>
+                <w:rFonts w:ascii="Mj_Casablanca Light" w:cs="Arial Unicode MS" w:hAnsi="Mj_Casablanca Light" w:eastAsia="Arial Unicode MS"/>
+                <w:b w:val="0"/>
+                <w:bCs w:val="0"/>
+                <w:i w:val="0"/>
+                <w:iCs w:val="0"/>
+                <w:caps w:val="0"/>
+                <w:smallCaps w:val="0"/>
+                <w:strike w:val="0"/>
+                <w:dstrike w:val="0"/>
+                <w:outline w:val="0"/>
+                <w:color w:val="000000"/>
+                <w:spacing w:val="0"/>
+                <w:kern w:val="0"/>
+                <w:position w:val="0"/>
+                <w:sz w:val="24"/>
+                <w:szCs w:val="24"/>
+                <w:u w:val="none" w:color="000000"/>
+                <w:shd w:val="nil" w:color="auto" w:fill="auto"/>
+                <w:vertAlign w:val="baseline"/>
+                <w:rtl w:val="0"/>
+                <w14:textOutline>
+                  <w14:noFill/>
+                </w14:textOutline>
+                <w14:textFill>
+                  <w14:solidFill>
+                    <w14:srgbClr w14:val="000000"/>
+                  </w14:solidFill>
+                </w14:textFill>
+              </w:rPr>
+              <w:t>Open</w:t>
+            </w:r>
+            <w:r>
+              <w:rPr>
+                <w:rFonts w:ascii="Arial Unicode MS" w:cs="Mj_Casablanca Light" w:hAnsi="Arial Unicode MS" w:eastAsia="Arial Unicode MS" w:hint="cs"/>
+                <w:b w:val="0"/>
+                <w:bCs w:val="0"/>
+                <w:i w:val="0"/>
+                <w:iCs w:val="0"/>
+                <w:caps w:val="0"/>
+                <w:smallCaps w:val="0"/>
+                <w:strike w:val="0"/>
+                <w:dstrike w:val="0"/>
+                <w:outline w:val="0"/>
+                <w:color w:val="000000"/>
+                <w:spacing w:val="0"/>
+                <w:kern w:val="0"/>
+                <w:position w:val="0"/>
+                <w:sz w:val="24"/>
+                <w:szCs w:val="24"/>
+                <w:u w:val="none" w:color="000000"/>
+                <w:shd w:val="nil" w:color="auto" w:fill="auto"/>
+                <w:vertAlign w:val="baseline"/>
+                <w:rtl w:val="1"/>
+                <w14:textOutline>
+                  <w14:noFill/>
+                </w14:textOutline>
+                <w14:textFill>
+                  <w14:solidFill>
+                    <w14:srgbClr w14:val="000000"/>
+                  </w14:solidFill>
+                </w14:textFill>
+              </w:rPr>
+              <w:t xml:space="preserve"> قرار میدیم</w:t>
+            </w:r>
+            <w:r>
+              <w:rPr>
+                <w:rFonts w:ascii="Mj_Casablanca Light" w:cs="Arial Unicode MS" w:hAnsi="Mj_Casablanca Light" w:eastAsia="Arial Unicode MS"/>
+                <w:b w:val="0"/>
+                <w:bCs w:val="0"/>
+                <w:i w:val="0"/>
+                <w:iCs w:val="0"/>
+                <w:caps w:val="0"/>
+                <w:smallCaps w:val="0"/>
+                <w:strike w:val="0"/>
+                <w:dstrike w:val="0"/>
+                <w:outline w:val="0"/>
+                <w:color w:val="000000"/>
+                <w:spacing w:val="0"/>
+                <w:kern w:val="0"/>
+                <w:position w:val="0"/>
+                <w:sz w:val="24"/>
+                <w:szCs w:val="24"/>
+                <w:u w:val="none" w:color="000000"/>
+                <w:shd w:val="nil" w:color="auto" w:fill="auto"/>
+                <w:vertAlign w:val="baseline"/>
+                <w:rtl w:val="1"/>
+                <w14:textOutline>
+                  <w14:noFill/>
+                </w14:textOutline>
+                <w14:textFill>
+                  <w14:solidFill>
+                    <w14:srgbClr w14:val="000000"/>
+                  </w14:solidFill>
+                </w14:textFill>
+              </w:rPr>
+              <w:t>.</w:t>
+            </w:r>
+          </w:p>
+        </w:tc>
+        <w:tc>
+          <w:tcPr>
+            <w:tcW w:type="dxa" w:w="1065"/>
+            <w:tcBorders>
+              <w:top w:val="single" w:color="929292" w:sz="4" w:space="0" w:shadow="0" w:frame="0"/>
+              <w:left w:val="single" w:color="89847f" w:sz="8" w:space="0" w:shadow="0" w:frame="0"/>
+              <w:bottom w:val="single" w:color="929292" w:sz="4" w:space="0" w:shadow="0" w:frame="0"/>
+              <w:right w:val="single" w:color="929292" w:sz="4" w:space="0" w:shadow="0" w:frame="0"/>
+            </w:tcBorders>
+            <w:shd w:val="clear" w:color="auto" w:fill="e6efff"/>
+            <w:tcMar>
+              <w:top w:type="dxa" w:w="80"/>
+              <w:left w:type="dxa" w:w="80"/>
+              <w:bottom w:type="dxa" w:w="80"/>
+              <w:right w:type="dxa" w:w="80"/>
+            </w:tcMar>
+            <w:vAlign w:val="center"/>
+          </w:tcPr>
+          <w:p/>
         </w:tc>
       </w:tr>
     </w:tbl>

</xml_diff>

<commit_message>
commit to make sure
</commit_message>
<xml_diff>
--- a/Documentation/Analysis/Project Standards/Project standards - W.docx
+++ b/Documentation/Analysis/Project Standards/Project standards - W.docx
@@ -724,6 +724,53 @@
                 <w:rtl w:val="1"/>
               </w:rPr>
             </w:pPr>
+            <w:r>
+              <w:rPr>
+                <w:rFonts w:ascii="Mj_Casablanca Light" w:hAnsi="Mj_Casablanca Light"/>
+                <w:rtl w:val="0"/>
+                <w:lang w:val="en-US"/>
+              </w:rPr>
+              <w:t xml:space="preserve"> </w:t>
+            </w:r>
+            <w:r>
+              <w:rPr>
+                <w:rFonts w:ascii="Arial Unicode MS" w:cs="Arial Unicode MS" w:hAnsi="Arial Unicode MS" w:eastAsia="Arial Unicode MS"/>
+                <w:b w:val="0"/>
+                <w:bCs w:val="0"/>
+                <w:i w:val="0"/>
+                <w:iCs w:val="0"/>
+                <w:rtl w:val="0"/>
+                <w:lang w:val="en-US"/>
+              </w:rPr>
+              <w:t>N</w:t>
+            </w:r>
+            <w:r>
+              <w:rPr>
+                <w:rFonts w:ascii="Mj_Casablanca Light" w:hAnsi="Mj_Casablanca Light"/>
+                <w:rtl w:val="0"/>
+                <w:lang w:val="en-US"/>
+              </w:rPr>
+              <w:t xml:space="preserve">: </w:t>
+            </w:r>
+            <w:r>
+              <w:rPr>
+                <w:rFonts w:ascii="Arial Unicode MS" w:cs="Arial Unicode MS" w:hAnsi="Arial Unicode MS" w:eastAsia="Arial Unicode MS"/>
+                <w:b w:val="0"/>
+                <w:bCs w:val="0"/>
+                <w:i w:val="0"/>
+                <w:iCs w:val="0"/>
+                <w:rtl w:val="0"/>
+                <w:lang w:val="en-US"/>
+              </w:rPr>
+              <w:t>Numbers</w:t>
+            </w:r>
+            <w:r>
+              <w:rPr>
+                <w:rFonts w:ascii="Arial Unicode MS" w:cs="Mj_Casablanca Light" w:hAnsi="Arial Unicode MS" w:eastAsia="Arial Unicode MS" w:hint="cs"/>
+                <w:rtl w:val="1"/>
+              </w:rPr>
+              <w:t xml:space="preserve">، </w:t>
+            </w:r>
             <w:r>
               <w:rPr>
                 <w:rFonts w:ascii="Arial Unicode MS" w:cs="Arial Unicode MS" w:hAnsi="Arial Unicode MS" w:eastAsia="Arial Unicode MS"/>

</xml_diff>